<commit_message>
Refactor automate_psur.py to dynamically update Chapter 5 narratives and fix en-dash splitting bug
</commit_message>
<xml_diff>
--- a/App J-003_Annex C_Preventive and corrective actions list..docx
+++ b/App J-003_Annex C_Preventive and corrective actions list..docx
@@ -18254,7 +18254,7 @@
                 <w:rFonts w:ascii="Calibri" w:hAnsi="Calibri"/>
                 <w:sz w:val="20"/>
               </w:rPr>
-              <w:t>0</w:t>
+              <w:t>5</w:t>
             </w:r>
           </w:p>
         </w:tc>
@@ -18278,7 +18278,7 @@
                 <w:rFonts w:ascii="Calibri" w:hAnsi="Calibri"/>
                 <w:sz w:val="20"/>
               </w:rPr>
-              <w:t>0 %</w:t>
+              <w:t>31.25 %</w:t>
             </w:r>
           </w:p>
         </w:tc>
@@ -18858,7 +18858,7 @@
                 <w:rFonts w:ascii="Calibri" w:hAnsi="Calibri"/>
                 <w:sz w:val="20"/>
               </w:rPr>
-              <w:t>0</w:t>
+              <w:t>5</w:t>
             </w:r>
           </w:p>
         </w:tc>
@@ -18882,7 +18882,7 @@
                 <w:rFonts w:ascii="Calibri" w:hAnsi="Calibri"/>
                 <w:sz w:val="20"/>
               </w:rPr>
-              <w:t>0 %</w:t>
+              <w:t>0.00 %</w:t>
             </w:r>
           </w:p>
         </w:tc>
@@ -20632,7 +20632,7 @@
                 <w:rFonts w:ascii="Calibri" w:hAnsi="Calibri"/>
                 <w:sz w:val="20"/>
               </w:rPr>
-              <w:t>0</w:t>
+              <w:t>2</w:t>
             </w:r>
           </w:p>
         </w:tc>
@@ -20656,7 +20656,7 @@
                 <w:rFonts w:ascii="Calibri" w:hAnsi="Calibri"/>
                 <w:sz w:val="20"/>
               </w:rPr>
-              <w:t>0 %</w:t>
+              <w:t>0.02 %</w:t>
             </w:r>
           </w:p>
         </w:tc>
@@ -20804,7 +20804,7 @@
                 <w:rFonts w:ascii="Calibri" w:hAnsi="Calibri"/>
                 <w:sz w:val="20"/>
               </w:rPr>
-              <w:t>0</w:t>
+              <w:t>3</w:t>
             </w:r>
           </w:p>
         </w:tc>
@@ -20828,7 +20828,7 @@
                 <w:rFonts w:ascii="Calibri" w:hAnsi="Calibri"/>
                 <w:sz w:val="20"/>
               </w:rPr>
-              <w:t>0 %</w:t>
+              <w:t>0.05 %</w:t>
             </w:r>
           </w:p>
         </w:tc>
@@ -20968,7 +20968,7 @@
                 <w:rFonts w:ascii="Calibri" w:hAnsi="Calibri"/>
                 <w:sz w:val="20"/>
               </w:rPr>
-              <w:t>0</w:t>
+              <w:t>1</w:t>
             </w:r>
           </w:p>
         </w:tc>
@@ -20992,7 +20992,7 @@
                 <w:rFonts w:ascii="Calibri" w:hAnsi="Calibri"/>
                 <w:sz w:val="20"/>
               </w:rPr>
-              <w:t>0 %</w:t>
+              <w:t>0.01 %</w:t>
             </w:r>
           </w:p>
         </w:tc>
@@ -21228,7 +21228,7 @@
                 <w:rFonts w:ascii="Calibri" w:hAnsi="Calibri"/>
                 <w:sz w:val="20"/>
               </w:rPr>
-              <w:t>0</w:t>
+              <w:t>3</w:t>
             </w:r>
           </w:p>
         </w:tc>
@@ -21252,7 +21252,7 @@
                 <w:rFonts w:ascii="Calibri" w:hAnsi="Calibri"/>
                 <w:sz w:val="20"/>
               </w:rPr>
-              <w:t>0 %</w:t>
+              <w:t>5.77 %</w:t>
             </w:r>
           </w:p>
         </w:tc>
@@ -22079,7 +22079,7 @@
                 <w:rFonts w:ascii="Calibri" w:hAnsi="Calibri"/>
                 <w:sz w:val="20"/>
               </w:rPr>
-              <w:t>0</w:t>
+              <w:t>3</w:t>
             </w:r>
           </w:p>
         </w:tc>
@@ -22103,7 +22103,7 @@
                 <w:rFonts w:ascii="Calibri" w:hAnsi="Calibri"/>
                 <w:sz w:val="20"/>
               </w:rPr>
-              <w:t>0 %</w:t>
+              <w:t>0.05 %</w:t>
             </w:r>
           </w:p>
         </w:tc>
@@ -22252,7 +22252,7 @@
                 <w:rFonts w:ascii="Calibri" w:hAnsi="Calibri"/>
                 <w:sz w:val="20"/>
               </w:rPr>
-              <w:t>0</w:t>
+              <w:t>1</w:t>
             </w:r>
           </w:p>
         </w:tc>
@@ -22276,7 +22276,7 @@
                 <w:rFonts w:ascii="Calibri" w:hAnsi="Calibri"/>
                 <w:sz w:val="20"/>
               </w:rPr>
-              <w:t>0 %</w:t>
+              <w:t>0.01 %</w:t>
             </w:r>
           </w:p>
         </w:tc>
@@ -22465,7 +22465,7 @@
                 <w:rFonts w:ascii="Calibri" w:hAnsi="Calibri"/>
                 <w:sz w:val="20"/>
               </w:rPr>
-              <w:t>0</w:t>
+              <w:t>1</w:t>
             </w:r>
           </w:p>
         </w:tc>
@@ -22489,7 +22489,7 @@
                 <w:rFonts w:ascii="Calibri" w:hAnsi="Calibri"/>
                 <w:sz w:val="20"/>
               </w:rPr>
-              <w:t>0 %</w:t>
+              <w:t>0.07 %</w:t>
             </w:r>
           </w:p>
         </w:tc>
@@ -22513,7 +22513,7 @@
                 <w:rFonts w:ascii="Calibri" w:hAnsi="Calibri"/>
                 <w:sz w:val="20"/>
               </w:rPr>
-              <w:t>0</w:t>
+              <w:t>2</w:t>
             </w:r>
           </w:p>
         </w:tc>
@@ -22537,7 +22537,7 @@
                 <w:rFonts w:ascii="Calibri" w:hAnsi="Calibri"/>
                 <w:sz w:val="20"/>
               </w:rPr>
-              <w:t>0 %</w:t>
+              <w:t>0.06 %</w:t>
             </w:r>
           </w:p>
         </w:tc>
@@ -23790,7 +23790,7 @@
                 <w:rFonts w:ascii="Calibri" w:hAnsi="Calibri"/>
                 <w:sz w:val="20"/>
               </w:rPr>
-              <w:t>0</w:t>
+              <w:t>1</w:t>
             </w:r>
           </w:p>
         </w:tc>
@@ -23814,7 +23814,7 @@
                 <w:rFonts w:ascii="Calibri" w:hAnsi="Calibri"/>
                 <w:sz w:val="20"/>
               </w:rPr>
-              <w:t>0 %</w:t>
+              <w:t>0.01 %</w:t>
             </w:r>
           </w:p>
         </w:tc>

</xml_diff>

<commit_message>
fix(automation): solve data duplication in Table 20 by refining model matching logic
</commit_message>
<xml_diff>
--- a/App J-003_Annex C_Preventive and corrective actions list..docx
+++ b/App J-003_Annex C_Preventive and corrective actions list..docx
@@ -15922,7 +15922,7 @@
                 <w:rFonts w:ascii="Calibri" w:hAnsi="Calibri"/>
                 <w:sz w:val="20"/>
               </w:rPr>
-              <w:t>5</w:t>
+              <w:t>1</w:t>
             </w:r>
           </w:p>
         </w:tc>
@@ -15946,7 +15946,7 @@
                 <w:rFonts w:ascii="Calibri" w:hAnsi="Calibri"/>
                 <w:sz w:val="20"/>
               </w:rPr>
-              <w:t>0.28 %</w:t>
+              <w:t>0.06 %</w:t>
             </w:r>
           </w:p>
         </w:tc>
@@ -16522,7 +16522,7 @@
                 <w:rFonts w:ascii="Calibri" w:hAnsi="Calibri"/>
                 <w:sz w:val="20"/>
               </w:rPr>
-              <w:t>3</w:t>
+              <w:t>1</w:t>
             </w:r>
           </w:p>
         </w:tc>
@@ -16546,7 +16546,7 @@
                 <w:rFonts w:ascii="Calibri" w:hAnsi="Calibri"/>
                 <w:sz w:val="20"/>
               </w:rPr>
-              <w:t>0.17 %</w:t>
+              <w:t>0.06 %</w:t>
             </w:r>
           </w:p>
         </w:tc>
@@ -17094,7 +17094,7 @@
                 <w:rFonts w:ascii="Calibri" w:hAnsi="Calibri"/>
                 <w:sz w:val="20"/>
               </w:rPr>
-              <w:t>1</w:t>
+              <w:t>0</w:t>
             </w:r>
           </w:p>
         </w:tc>
@@ -17118,7 +17118,7 @@
                 <w:rFonts w:ascii="Calibri" w:hAnsi="Calibri"/>
                 <w:sz w:val="20"/>
               </w:rPr>
-              <w:t>0.76 %</w:t>
+              <w:t>0 %</w:t>
             </w:r>
           </w:p>
         </w:tc>
@@ -17838,7 +17838,7 @@
                 <w:rFonts w:ascii="Calibri" w:hAnsi="Calibri"/>
                 <w:sz w:val="20"/>
               </w:rPr>
-              <w:t>2</w:t>
+              <w:t>0</w:t>
             </w:r>
           </w:p>
         </w:tc>
@@ -17862,7 +17862,7 @@
                 <w:rFonts w:ascii="Calibri" w:hAnsi="Calibri"/>
                 <w:sz w:val="20"/>
               </w:rPr>
-              <w:t>25.00 %</w:t>
+              <w:t>0 %</w:t>
             </w:r>
           </w:p>
         </w:tc>
@@ -18254,7 +18254,7 @@
                 <w:rFonts w:ascii="Calibri" w:hAnsi="Calibri"/>
                 <w:sz w:val="20"/>
               </w:rPr>
-              <w:t>5</w:t>
+              <w:t>1</w:t>
             </w:r>
           </w:p>
         </w:tc>
@@ -18278,7 +18278,7 @@
                 <w:rFonts w:ascii="Calibri" w:hAnsi="Calibri"/>
                 <w:sz w:val="20"/>
               </w:rPr>
-              <w:t>31.25 %</w:t>
+              <w:t>6.25 %</w:t>
             </w:r>
           </w:p>
         </w:tc>
@@ -18858,7 +18858,7 @@
                 <w:rFonts w:ascii="Calibri" w:hAnsi="Calibri"/>
                 <w:sz w:val="20"/>
               </w:rPr>
-              <w:t>5</w:t>
+              <w:t>1</w:t>
             </w:r>
           </w:p>
         </w:tc>
@@ -19438,7 +19438,7 @@
                 <w:rFonts w:ascii="Calibri" w:hAnsi="Calibri"/>
                 <w:sz w:val="20"/>
               </w:rPr>
-              <w:t>5</w:t>
+              <w:t>3</w:t>
             </w:r>
           </w:p>
         </w:tc>
@@ -20036,7 +20036,7 @@
                 <w:rFonts w:ascii="Calibri" w:hAnsi="Calibri"/>
                 <w:sz w:val="20"/>
               </w:rPr>
-              <w:t>3</w:t>
+              <w:t>2</w:t>
             </w:r>
           </w:p>
         </w:tc>
@@ -20060,7 +20060,7 @@
                 <w:rFonts w:ascii="Calibri" w:hAnsi="Calibri"/>
                 <w:sz w:val="20"/>
               </w:rPr>
-              <w:t>0.17 %</w:t>
+              <w:t>0.11 %</w:t>
             </w:r>
           </w:p>
         </w:tc>
@@ -20632,7 +20632,7 @@
                 <w:rFonts w:ascii="Calibri" w:hAnsi="Calibri"/>
                 <w:sz w:val="20"/>
               </w:rPr>
-              <w:t>2</w:t>
+              <w:t>1</w:t>
             </w:r>
           </w:p>
         </w:tc>
@@ -20656,7 +20656,7 @@
                 <w:rFonts w:ascii="Calibri" w:hAnsi="Calibri"/>
                 <w:sz w:val="20"/>
               </w:rPr>
-              <w:t>0.02 %</w:t>
+              <w:t>0.01 %</w:t>
             </w:r>
           </w:p>
         </w:tc>
@@ -20804,7 +20804,7 @@
                 <w:rFonts w:ascii="Calibri" w:hAnsi="Calibri"/>
                 <w:sz w:val="20"/>
               </w:rPr>
-              <w:t>3</w:t>
+              <w:t>0</w:t>
             </w:r>
           </w:p>
         </w:tc>
@@ -20828,7 +20828,7 @@
                 <w:rFonts w:ascii="Calibri" w:hAnsi="Calibri"/>
                 <w:sz w:val="20"/>
               </w:rPr>
-              <w:t>0.05 %</w:t>
+              <w:t>0 %</w:t>
             </w:r>
           </w:p>
         </w:tc>
@@ -20968,7 +20968,7 @@
                 <w:rFonts w:ascii="Calibri" w:hAnsi="Calibri"/>
                 <w:sz w:val="20"/>
               </w:rPr>
-              <w:t>1</w:t>
+              <w:t>0</w:t>
             </w:r>
           </w:p>
         </w:tc>
@@ -20992,7 +20992,7 @@
                 <w:rFonts w:ascii="Calibri" w:hAnsi="Calibri"/>
                 <w:sz w:val="20"/>
               </w:rPr>
-              <w:t>0.01 %</w:t>
+              <w:t>0 %</w:t>
             </w:r>
           </w:p>
         </w:tc>
@@ -21228,7 +21228,7 @@
                 <w:rFonts w:ascii="Calibri" w:hAnsi="Calibri"/>
                 <w:sz w:val="20"/>
               </w:rPr>
-              <w:t>3</w:t>
+              <w:t>1</w:t>
             </w:r>
           </w:p>
         </w:tc>
@@ -21252,7 +21252,7 @@
                 <w:rFonts w:ascii="Calibri" w:hAnsi="Calibri"/>
                 <w:sz w:val="20"/>
               </w:rPr>
-              <w:t>5.77 %</w:t>
+              <w:t>1.92 %</w:t>
             </w:r>
           </w:p>
         </w:tc>
@@ -22079,7 +22079,7 @@
                 <w:rFonts w:ascii="Calibri" w:hAnsi="Calibri"/>
                 <w:sz w:val="20"/>
               </w:rPr>
-              <w:t>3</w:t>
+              <w:t>1</w:t>
             </w:r>
           </w:p>
         </w:tc>
@@ -22103,7 +22103,7 @@
                 <w:rFonts w:ascii="Calibri" w:hAnsi="Calibri"/>
                 <w:sz w:val="20"/>
               </w:rPr>
-              <w:t>0.05 %</w:t>
+              <w:t>0.02 %</w:t>
             </w:r>
           </w:p>
         </w:tc>
@@ -22252,7 +22252,7 @@
                 <w:rFonts w:ascii="Calibri" w:hAnsi="Calibri"/>
                 <w:sz w:val="20"/>
               </w:rPr>
-              <w:t>1</w:t>
+              <w:t>0</w:t>
             </w:r>
           </w:p>
         </w:tc>
@@ -22276,7 +22276,7 @@
                 <w:rFonts w:ascii="Calibri" w:hAnsi="Calibri"/>
                 <w:sz w:val="20"/>
               </w:rPr>
-              <w:t>0.01 %</w:t>
+              <w:t>0 %</w:t>
             </w:r>
           </w:p>
         </w:tc>

</xml_diff>

<commit_message>
style(automation): format all rates and percentages to use .2f% and ensure 0.00% displays
</commit_message>
<xml_diff>
--- a/App J-003_Annex C_Preventive and corrective actions list..docx
+++ b/App J-003_Annex C_Preventive and corrective actions list..docx
@@ -13053,7 +13053,7 @@
                 <w:rFonts w:ascii="Calibri" w:hAnsi="Calibri"/>
                 <w:sz w:val="20"/>
               </w:rPr>
-              <w:t>0 %</w:t>
+              <w:t>0.00%</w:t>
             </w:r>
           </w:p>
         </w:tc>
@@ -13101,7 +13101,7 @@
                 <w:rFonts w:ascii="Calibri" w:hAnsi="Calibri"/>
                 <w:sz w:val="20"/>
               </w:rPr>
-              <w:t>0.00 %</w:t>
+              <w:t>0.00%</w:t>
             </w:r>
           </w:p>
         </w:tc>
@@ -13225,7 +13225,7 @@
                 <w:rFonts w:ascii="Calibri" w:hAnsi="Calibri"/>
                 <w:sz w:val="20"/>
               </w:rPr>
-              <w:t>0 %</w:t>
+              <w:t>0.00%</w:t>
             </w:r>
           </w:p>
         </w:tc>
@@ -13273,7 +13273,7 @@
                 <w:rFonts w:ascii="Calibri" w:hAnsi="Calibri"/>
                 <w:sz w:val="20"/>
               </w:rPr>
-              <w:t>0 %</w:t>
+              <w:t>0.00%</w:t>
             </w:r>
           </w:p>
         </w:tc>
@@ -13389,7 +13389,7 @@
                 <w:rFonts w:ascii="Calibri" w:hAnsi="Calibri"/>
                 <w:sz w:val="20"/>
               </w:rPr>
-              <w:t>0 %</w:t>
+              <w:t>0.00%</w:t>
             </w:r>
           </w:p>
         </w:tc>
@@ -13437,7 +13437,7 @@
                 <w:rFonts w:ascii="Calibri" w:hAnsi="Calibri"/>
                 <w:sz w:val="20"/>
               </w:rPr>
-              <w:t>0 %</w:t>
+              <w:t>0.00%</w:t>
             </w:r>
           </w:p>
         </w:tc>
@@ -13553,7 +13553,7 @@
                 <w:rFonts w:ascii="Calibri" w:hAnsi="Calibri"/>
                 <w:sz w:val="20"/>
               </w:rPr>
-              <w:t>0 %</w:t>
+              <w:t>0.00%</w:t>
             </w:r>
           </w:p>
         </w:tc>
@@ -13601,7 +13601,7 @@
                 <w:rFonts w:ascii="Calibri" w:hAnsi="Calibri"/>
                 <w:sz w:val="20"/>
               </w:rPr>
-              <w:t>0 %</w:t>
+              <w:t>0.00%</w:t>
             </w:r>
           </w:p>
         </w:tc>
@@ -13800,7 +13800,7 @@
                 <w:rFonts w:ascii="Calibri" w:hAnsi="Calibri"/>
                 <w:sz w:val="20"/>
               </w:rPr>
-              <w:t>0 %</w:t>
+              <w:t>0.00%</w:t>
             </w:r>
           </w:p>
         </w:tc>
@@ -13848,7 +13848,7 @@
                 <w:rFonts w:ascii="Calibri" w:hAnsi="Calibri"/>
                 <w:sz w:val="20"/>
               </w:rPr>
-              <w:t>0.00 %</w:t>
+              <w:t>0.00%</w:t>
             </w:r>
           </w:p>
         </w:tc>
@@ -13972,7 +13972,7 @@
                 <w:rFonts w:ascii="Calibri" w:hAnsi="Calibri"/>
                 <w:sz w:val="20"/>
               </w:rPr>
-              <w:t>0 %</w:t>
+              <w:t>0.00%</w:t>
             </w:r>
           </w:p>
         </w:tc>
@@ -14020,7 +14020,7 @@
                 <w:rFonts w:ascii="Calibri" w:hAnsi="Calibri"/>
                 <w:sz w:val="20"/>
               </w:rPr>
-              <w:t>0 %</w:t>
+              <w:t>0.00%</w:t>
             </w:r>
           </w:p>
         </w:tc>
@@ -14139,7 +14139,7 @@
                 <w:rFonts w:ascii="Calibri" w:hAnsi="Calibri"/>
                 <w:sz w:val="20"/>
               </w:rPr>
-              <w:t>0 %</w:t>
+              <w:t>0.00%</w:t>
             </w:r>
           </w:p>
         </w:tc>
@@ -14187,7 +14187,7 @@
                 <w:rFonts w:ascii="Calibri" w:hAnsi="Calibri"/>
                 <w:sz w:val="20"/>
               </w:rPr>
-              <w:t>0 %</w:t>
+              <w:t>0.00%</w:t>
             </w:r>
           </w:p>
         </w:tc>
@@ -14303,7 +14303,7 @@
                 <w:rFonts w:ascii="Calibri" w:hAnsi="Calibri"/>
                 <w:sz w:val="20"/>
               </w:rPr>
-              <w:t>0 %</w:t>
+              <w:t>0.00%</w:t>
             </w:r>
           </w:p>
         </w:tc>
@@ -14351,7 +14351,7 @@
                 <w:rFonts w:ascii="Calibri" w:hAnsi="Calibri"/>
                 <w:sz w:val="20"/>
               </w:rPr>
-              <w:t>0 %</w:t>
+              <w:t>0.00%</w:t>
             </w:r>
           </w:p>
         </w:tc>
@@ -14550,7 +14550,7 @@
                 <w:rFonts w:ascii="Calibri" w:hAnsi="Calibri"/>
                 <w:sz w:val="20"/>
               </w:rPr>
-              <w:t>0 %</w:t>
+              <w:t>0.00%</w:t>
             </w:r>
           </w:p>
         </w:tc>
@@ -14598,7 +14598,7 @@
                 <w:rFonts w:ascii="Calibri" w:hAnsi="Calibri"/>
                 <w:sz w:val="20"/>
               </w:rPr>
-              <w:t>0.00 %</w:t>
+              <w:t>0.00%</w:t>
             </w:r>
           </w:p>
         </w:tc>
@@ -14722,7 +14722,7 @@
                 <w:rFonts w:ascii="Calibri" w:hAnsi="Calibri"/>
                 <w:sz w:val="20"/>
               </w:rPr>
-              <w:t>0 %</w:t>
+              <w:t>0.00%</w:t>
             </w:r>
           </w:p>
         </w:tc>
@@ -14770,7 +14770,7 @@
                 <w:rFonts w:ascii="Calibri" w:hAnsi="Calibri"/>
                 <w:sz w:val="20"/>
               </w:rPr>
-              <w:t>0 %</w:t>
+              <w:t>0.00%</w:t>
             </w:r>
           </w:p>
         </w:tc>
@@ -14886,7 +14886,7 @@
                 <w:rFonts w:ascii="Calibri" w:hAnsi="Calibri"/>
                 <w:sz w:val="20"/>
               </w:rPr>
-              <w:t>0 %</w:t>
+              <w:t>0.00%</w:t>
             </w:r>
           </w:p>
         </w:tc>
@@ -14934,7 +14934,7 @@
                 <w:rFonts w:ascii="Calibri" w:hAnsi="Calibri"/>
                 <w:sz w:val="20"/>
               </w:rPr>
-              <w:t>0 %</w:t>
+              <w:t>0.00%</w:t>
             </w:r>
           </w:p>
         </w:tc>
@@ -15050,7 +15050,7 @@
                 <w:rFonts w:ascii="Calibri" w:hAnsi="Calibri"/>
                 <w:sz w:val="20"/>
               </w:rPr>
-              <w:t>0 %</w:t>
+              <w:t>0.00%</w:t>
             </w:r>
           </w:p>
         </w:tc>
@@ -15098,7 +15098,7 @@
                 <w:rFonts w:ascii="Calibri" w:hAnsi="Calibri"/>
                 <w:sz w:val="20"/>
               </w:rPr>
-              <w:t>0 %</w:t>
+              <w:t>0.00%</w:t>
             </w:r>
           </w:p>
         </w:tc>
@@ -15297,7 +15297,7 @@
                 <w:rFonts w:ascii="Calibri" w:hAnsi="Calibri"/>
                 <w:sz w:val="20"/>
               </w:rPr>
-              <w:t>0 %</w:t>
+              <w:t>0.00%</w:t>
             </w:r>
           </w:p>
         </w:tc>
@@ -15345,7 +15345,7 @@
                 <w:rFonts w:ascii="Calibri" w:hAnsi="Calibri"/>
                 <w:sz w:val="20"/>
               </w:rPr>
-              <w:t>0.01 %</w:t>
+              <w:t>0.01%</w:t>
             </w:r>
           </w:p>
         </w:tc>
@@ -15469,7 +15469,7 @@
                 <w:rFonts w:ascii="Calibri" w:hAnsi="Calibri"/>
                 <w:sz w:val="20"/>
               </w:rPr>
-              <w:t>0 %</w:t>
+              <w:t>0.00%</w:t>
             </w:r>
           </w:p>
         </w:tc>
@@ -15517,7 +15517,7 @@
                 <w:rFonts w:ascii="Calibri" w:hAnsi="Calibri"/>
                 <w:sz w:val="20"/>
               </w:rPr>
-              <w:t>0 %</w:t>
+              <w:t>0.00%</w:t>
             </w:r>
           </w:p>
         </w:tc>
@@ -15633,7 +15633,7 @@
                 <w:rFonts w:ascii="Calibri" w:hAnsi="Calibri"/>
                 <w:sz w:val="20"/>
               </w:rPr>
-              <w:t>0 %</w:t>
+              <w:t>0.00%</w:t>
             </w:r>
           </w:p>
         </w:tc>
@@ -15681,7 +15681,7 @@
                 <w:rFonts w:ascii="Calibri" w:hAnsi="Calibri"/>
                 <w:sz w:val="20"/>
               </w:rPr>
-              <w:t>0 %</w:t>
+              <w:t>0.00%</w:t>
             </w:r>
           </w:p>
         </w:tc>
@@ -15898,7 +15898,7 @@
                 <w:rFonts w:ascii="Calibri" w:hAnsi="Calibri"/>
                 <w:sz w:val="20"/>
               </w:rPr>
-              <w:t>0 %</w:t>
+              <w:t>0.00%</w:t>
             </w:r>
           </w:p>
         </w:tc>
@@ -15946,7 +15946,7 @@
                 <w:rFonts w:ascii="Calibri" w:hAnsi="Calibri"/>
                 <w:sz w:val="20"/>
               </w:rPr>
-              <w:t>0.06 %</w:t>
+              <w:t>0.06%</w:t>
             </w:r>
           </w:p>
         </w:tc>
@@ -16070,7 +16070,7 @@
                 <w:rFonts w:ascii="Calibri" w:hAnsi="Calibri"/>
                 <w:sz w:val="20"/>
               </w:rPr>
-              <w:t>0 %</w:t>
+              <w:t>0.00%</w:t>
             </w:r>
           </w:p>
         </w:tc>
@@ -16118,7 +16118,7 @@
                 <w:rFonts w:ascii="Calibri" w:hAnsi="Calibri"/>
                 <w:sz w:val="20"/>
               </w:rPr>
-              <w:t>0 %</w:t>
+              <w:t>0.00%</w:t>
             </w:r>
           </w:p>
         </w:tc>
@@ -16234,7 +16234,7 @@
                 <w:rFonts w:ascii="Calibri" w:hAnsi="Calibri"/>
                 <w:sz w:val="20"/>
               </w:rPr>
-              <w:t>0 %</w:t>
+              <w:t>0.00%</w:t>
             </w:r>
           </w:p>
         </w:tc>
@@ -16282,7 +16282,7 @@
                 <w:rFonts w:ascii="Calibri" w:hAnsi="Calibri"/>
                 <w:sz w:val="20"/>
               </w:rPr>
-              <w:t>0 %</w:t>
+              <w:t>0.00%</w:t>
             </w:r>
           </w:p>
         </w:tc>
@@ -16498,7 +16498,7 @@
                 <w:rFonts w:ascii="Calibri" w:hAnsi="Calibri"/>
                 <w:sz w:val="20"/>
               </w:rPr>
-              <w:t>0 %</w:t>
+              <w:t>0.00%</w:t>
             </w:r>
           </w:p>
         </w:tc>
@@ -16546,7 +16546,7 @@
                 <w:rFonts w:ascii="Calibri" w:hAnsi="Calibri"/>
                 <w:sz w:val="20"/>
               </w:rPr>
-              <w:t>0.06 %</w:t>
+              <w:t>0.06%</w:t>
             </w:r>
           </w:p>
         </w:tc>
@@ -16670,7 +16670,7 @@
                 <w:rFonts w:ascii="Calibri" w:hAnsi="Calibri"/>
                 <w:sz w:val="20"/>
               </w:rPr>
-              <w:t>0 %</w:t>
+              <w:t>0.00%</w:t>
             </w:r>
           </w:p>
         </w:tc>
@@ -16718,7 +16718,7 @@
                 <w:rFonts w:ascii="Calibri" w:hAnsi="Calibri"/>
                 <w:sz w:val="20"/>
               </w:rPr>
-              <w:t>0 %</w:t>
+              <w:t>0.00%</w:t>
             </w:r>
           </w:p>
         </w:tc>
@@ -16834,7 +16834,7 @@
                 <w:rFonts w:ascii="Calibri" w:hAnsi="Calibri"/>
                 <w:sz w:val="20"/>
               </w:rPr>
-              <w:t>0 %</w:t>
+              <w:t>0.00%</w:t>
             </w:r>
           </w:p>
         </w:tc>
@@ -16882,7 +16882,7 @@
                 <w:rFonts w:ascii="Calibri" w:hAnsi="Calibri"/>
                 <w:sz w:val="20"/>
               </w:rPr>
-              <w:t>0 %</w:t>
+              <w:t>0.00%</w:t>
             </w:r>
           </w:p>
         </w:tc>
@@ -17070,7 +17070,7 @@
                 <w:rFonts w:ascii="Calibri" w:hAnsi="Calibri"/>
                 <w:sz w:val="20"/>
               </w:rPr>
-              <w:t>0 %</w:t>
+              <w:t>0.00%</w:t>
             </w:r>
           </w:p>
         </w:tc>
@@ -17118,7 +17118,7 @@
                 <w:rFonts w:ascii="Calibri" w:hAnsi="Calibri"/>
                 <w:sz w:val="20"/>
               </w:rPr>
-              <w:t>0 %</w:t>
+              <w:t>0.00%</w:t>
             </w:r>
           </w:p>
         </w:tc>
@@ -17242,7 +17242,7 @@
                 <w:rFonts w:ascii="Calibri" w:hAnsi="Calibri"/>
                 <w:sz w:val="20"/>
               </w:rPr>
-              <w:t>0 %</w:t>
+              <w:t>0.00%</w:t>
             </w:r>
           </w:p>
         </w:tc>
@@ -17290,7 +17290,7 @@
                 <w:rFonts w:ascii="Calibri" w:hAnsi="Calibri"/>
                 <w:sz w:val="20"/>
               </w:rPr>
-              <w:t>0 %</w:t>
+              <w:t>0.00%</w:t>
             </w:r>
           </w:p>
         </w:tc>
@@ -17406,7 +17406,7 @@
                 <w:rFonts w:ascii="Calibri" w:hAnsi="Calibri"/>
                 <w:sz w:val="20"/>
               </w:rPr>
-              <w:t>0 %</w:t>
+              <w:t>0.00%</w:t>
             </w:r>
           </w:p>
         </w:tc>
@@ -17454,7 +17454,7 @@
                 <w:rFonts w:ascii="Calibri" w:hAnsi="Calibri"/>
                 <w:sz w:val="20"/>
               </w:rPr>
-              <w:t>0 %</w:t>
+              <w:t>0.00%</w:t>
             </w:r>
           </w:p>
         </w:tc>
@@ -17642,7 +17642,7 @@
                 <w:rFonts w:ascii="Calibri" w:hAnsi="Calibri"/>
                 <w:sz w:val="20"/>
               </w:rPr>
-              <w:t>0 %</w:t>
+              <w:t>0.00%</w:t>
             </w:r>
           </w:p>
         </w:tc>
@@ -17690,7 +17690,7 @@
                 <w:rFonts w:ascii="Calibri" w:hAnsi="Calibri"/>
                 <w:sz w:val="20"/>
               </w:rPr>
-              <w:t>6.25 %</w:t>
+              <w:t>6.25%</w:t>
             </w:r>
           </w:p>
         </w:tc>
@@ -17814,7 +17814,7 @@
                 <w:rFonts w:ascii="Calibri" w:hAnsi="Calibri"/>
                 <w:sz w:val="20"/>
               </w:rPr>
-              <w:t>0 %</w:t>
+              <w:t>0.00%</w:t>
             </w:r>
           </w:p>
         </w:tc>
@@ -17862,7 +17862,7 @@
                 <w:rFonts w:ascii="Calibri" w:hAnsi="Calibri"/>
                 <w:sz w:val="20"/>
               </w:rPr>
-              <w:t>0 %</w:t>
+              <w:t>0.00%</w:t>
             </w:r>
           </w:p>
         </w:tc>
@@ -17978,7 +17978,7 @@
                 <w:rFonts w:ascii="Calibri" w:hAnsi="Calibri"/>
                 <w:sz w:val="20"/>
               </w:rPr>
-              <w:t>0 %</w:t>
+              <w:t>0.00%</w:t>
             </w:r>
           </w:p>
         </w:tc>
@@ -18026,7 +18026,7 @@
                 <w:rFonts w:ascii="Calibri" w:hAnsi="Calibri"/>
                 <w:sz w:val="20"/>
               </w:rPr>
-              <w:t>0 %</w:t>
+              <w:t>0.00%</w:t>
             </w:r>
           </w:p>
         </w:tc>
@@ -18230,7 +18230,7 @@
                 <w:rFonts w:ascii="Calibri" w:hAnsi="Calibri"/>
                 <w:sz w:val="20"/>
               </w:rPr>
-              <w:t>0 %</w:t>
+              <w:t>0.00%</w:t>
             </w:r>
           </w:p>
         </w:tc>
@@ -18278,7 +18278,7 @@
                 <w:rFonts w:ascii="Calibri" w:hAnsi="Calibri"/>
                 <w:sz w:val="20"/>
               </w:rPr>
-              <w:t>6.25 %</w:t>
+              <w:t>6.25%</w:t>
             </w:r>
           </w:p>
         </w:tc>
@@ -18402,7 +18402,7 @@
                 <w:rFonts w:ascii="Calibri" w:hAnsi="Calibri"/>
                 <w:sz w:val="20"/>
               </w:rPr>
-              <w:t>0 %</w:t>
+              <w:t>0.00%</w:t>
             </w:r>
           </w:p>
         </w:tc>
@@ -18450,7 +18450,7 @@
                 <w:rFonts w:ascii="Calibri" w:hAnsi="Calibri"/>
                 <w:sz w:val="20"/>
               </w:rPr>
-              <w:t>0 %</w:t>
+              <w:t>0.00%</w:t>
             </w:r>
           </w:p>
         </w:tc>
@@ -18566,7 +18566,7 @@
                 <w:rFonts w:ascii="Calibri" w:hAnsi="Calibri"/>
                 <w:sz w:val="20"/>
               </w:rPr>
-              <w:t>0 %</w:t>
+              <w:t>0.00%</w:t>
             </w:r>
           </w:p>
         </w:tc>
@@ -18614,7 +18614,7 @@
                 <w:rFonts w:ascii="Calibri" w:hAnsi="Calibri"/>
                 <w:sz w:val="20"/>
               </w:rPr>
-              <w:t>0 %</w:t>
+              <w:t>0.00%</w:t>
             </w:r>
           </w:p>
         </w:tc>
@@ -18834,7 +18834,7 @@
                 <w:rFonts w:ascii="Calibri" w:hAnsi="Calibri"/>
                 <w:sz w:val="20"/>
               </w:rPr>
-              <w:t>0 %</w:t>
+              <w:t>0.00%</w:t>
             </w:r>
           </w:p>
         </w:tc>
@@ -18882,7 +18882,7 @@
                 <w:rFonts w:ascii="Calibri" w:hAnsi="Calibri"/>
                 <w:sz w:val="20"/>
               </w:rPr>
-              <w:t>0.00 %</w:t>
+              <w:t>0.00%</w:t>
             </w:r>
           </w:p>
         </w:tc>
@@ -19006,7 +19006,7 @@
                 <w:rFonts w:ascii="Calibri" w:hAnsi="Calibri"/>
                 <w:sz w:val="20"/>
               </w:rPr>
-              <w:t>0 %</w:t>
+              <w:t>0.00%</w:t>
             </w:r>
           </w:p>
         </w:tc>
@@ -19054,7 +19054,7 @@
                 <w:rFonts w:ascii="Calibri" w:hAnsi="Calibri"/>
                 <w:sz w:val="20"/>
               </w:rPr>
-              <w:t>0 %</w:t>
+              <w:t>0.00%</w:t>
             </w:r>
           </w:p>
         </w:tc>
@@ -19170,7 +19170,7 @@
                 <w:rFonts w:ascii="Calibri" w:hAnsi="Calibri"/>
                 <w:sz w:val="20"/>
               </w:rPr>
-              <w:t>0 %</w:t>
+              <w:t>0.00%</w:t>
             </w:r>
           </w:p>
         </w:tc>
@@ -19218,7 +19218,7 @@
                 <w:rFonts w:ascii="Calibri" w:hAnsi="Calibri"/>
                 <w:sz w:val="20"/>
               </w:rPr>
-              <w:t>0 %</w:t>
+              <w:t>0.00%</w:t>
             </w:r>
           </w:p>
         </w:tc>
@@ -19414,7 +19414,7 @@
                 <w:rFonts w:ascii="Calibri" w:hAnsi="Calibri"/>
                 <w:sz w:val="20"/>
               </w:rPr>
-              <w:t>0 %</w:t>
+              <w:t>0.00%</w:t>
             </w:r>
           </w:p>
         </w:tc>
@@ -19462,7 +19462,7 @@
                 <w:rFonts w:ascii="Calibri" w:hAnsi="Calibri"/>
                 <w:sz w:val="20"/>
               </w:rPr>
-              <w:t>0.00 %</w:t>
+              <w:t>0.00%</w:t>
             </w:r>
           </w:p>
         </w:tc>
@@ -19586,7 +19586,7 @@
                 <w:rFonts w:ascii="Calibri" w:hAnsi="Calibri"/>
                 <w:sz w:val="20"/>
               </w:rPr>
-              <w:t>0 %</w:t>
+              <w:t>0.00%</w:t>
             </w:r>
           </w:p>
         </w:tc>
@@ -19634,7 +19634,7 @@
                 <w:rFonts w:ascii="Calibri" w:hAnsi="Calibri"/>
                 <w:sz w:val="20"/>
               </w:rPr>
-              <w:t>0 %</w:t>
+              <w:t>0.00%</w:t>
             </w:r>
           </w:p>
         </w:tc>
@@ -19750,7 +19750,7 @@
                 <w:rFonts w:ascii="Calibri" w:hAnsi="Calibri"/>
                 <w:sz w:val="20"/>
               </w:rPr>
-              <w:t>0 %</w:t>
+              <w:t>0.00%</w:t>
             </w:r>
           </w:p>
         </w:tc>
@@ -19798,7 +19798,7 @@
                 <w:rFonts w:ascii="Calibri" w:hAnsi="Calibri"/>
                 <w:sz w:val="20"/>
               </w:rPr>
-              <w:t>0 %</w:t>
+              <w:t>0.00%</w:t>
             </w:r>
           </w:p>
         </w:tc>
@@ -20012,7 +20012,7 @@
                 <w:rFonts w:ascii="Calibri" w:hAnsi="Calibri"/>
                 <w:sz w:val="20"/>
               </w:rPr>
-              <w:t>0 %</w:t>
+              <w:t>0.00%</w:t>
             </w:r>
           </w:p>
         </w:tc>
@@ -20060,7 +20060,7 @@
                 <w:rFonts w:ascii="Calibri" w:hAnsi="Calibri"/>
                 <w:sz w:val="20"/>
               </w:rPr>
-              <w:t>0.11 %</w:t>
+              <w:t>0.11%</w:t>
             </w:r>
           </w:p>
         </w:tc>
@@ -20184,7 +20184,7 @@
                 <w:rFonts w:ascii="Calibri" w:hAnsi="Calibri"/>
                 <w:sz w:val="20"/>
               </w:rPr>
-              <w:t>0 %</w:t>
+              <w:t>0.00%</w:t>
             </w:r>
           </w:p>
         </w:tc>
@@ -20232,7 +20232,7 @@
                 <w:rFonts w:ascii="Calibri" w:hAnsi="Calibri"/>
                 <w:sz w:val="20"/>
               </w:rPr>
-              <w:t>0 %</w:t>
+              <w:t>0.00%</w:t>
             </w:r>
           </w:p>
         </w:tc>
@@ -20348,7 +20348,7 @@
                 <w:rFonts w:ascii="Calibri" w:hAnsi="Calibri"/>
                 <w:sz w:val="20"/>
               </w:rPr>
-              <w:t>0 %</w:t>
+              <w:t>0.00%</w:t>
             </w:r>
           </w:p>
         </w:tc>
@@ -20396,7 +20396,7 @@
                 <w:rFonts w:ascii="Calibri" w:hAnsi="Calibri"/>
                 <w:sz w:val="20"/>
               </w:rPr>
-              <w:t>0 %</w:t>
+              <w:t>0.00%</w:t>
             </w:r>
           </w:p>
         </w:tc>
@@ -20608,7 +20608,7 @@
                 <w:rFonts w:ascii="Calibri" w:hAnsi="Calibri"/>
                 <w:sz w:val="20"/>
               </w:rPr>
-              <w:t>0 %</w:t>
+              <w:t>0.00%</w:t>
             </w:r>
           </w:p>
         </w:tc>
@@ -20656,7 +20656,7 @@
                 <w:rFonts w:ascii="Calibri" w:hAnsi="Calibri"/>
                 <w:sz w:val="20"/>
               </w:rPr>
-              <w:t>0.01 %</w:t>
+              <w:t>0.01%</w:t>
             </w:r>
           </w:p>
         </w:tc>
@@ -20780,7 +20780,7 @@
                 <w:rFonts w:ascii="Calibri" w:hAnsi="Calibri"/>
                 <w:sz w:val="20"/>
               </w:rPr>
-              <w:t>0 %</w:t>
+              <w:t>0.00%</w:t>
             </w:r>
           </w:p>
         </w:tc>
@@ -20828,7 +20828,7 @@
                 <w:rFonts w:ascii="Calibri" w:hAnsi="Calibri"/>
                 <w:sz w:val="20"/>
               </w:rPr>
-              <w:t>0 %</w:t>
+              <w:t>0.00%</w:t>
             </w:r>
           </w:p>
         </w:tc>
@@ -20944,7 +20944,7 @@
                 <w:rFonts w:ascii="Calibri" w:hAnsi="Calibri"/>
                 <w:sz w:val="20"/>
               </w:rPr>
-              <w:t>0 %</w:t>
+              <w:t>0.00%</w:t>
             </w:r>
           </w:p>
         </w:tc>
@@ -20992,7 +20992,7 @@
                 <w:rFonts w:ascii="Calibri" w:hAnsi="Calibri"/>
                 <w:sz w:val="20"/>
               </w:rPr>
-              <w:t>0 %</w:t>
+              <w:t>0.00%</w:t>
             </w:r>
           </w:p>
         </w:tc>
@@ -21204,7 +21204,7 @@
                 <w:rFonts w:ascii="Calibri" w:hAnsi="Calibri"/>
                 <w:sz w:val="20"/>
               </w:rPr>
-              <w:t>0 %</w:t>
+              <w:t>0.00%</w:t>
             </w:r>
           </w:p>
         </w:tc>
@@ -21252,7 +21252,7 @@
                 <w:rFonts w:ascii="Calibri" w:hAnsi="Calibri"/>
                 <w:sz w:val="20"/>
               </w:rPr>
-              <w:t>1.92 %</w:t>
+              <w:t>1.92%</w:t>
             </w:r>
           </w:p>
         </w:tc>
@@ -21376,7 +21376,7 @@
                 <w:rFonts w:ascii="Calibri" w:hAnsi="Calibri"/>
                 <w:sz w:val="20"/>
               </w:rPr>
-              <w:t>0 %</w:t>
+              <w:t>0.00%</w:t>
             </w:r>
           </w:p>
         </w:tc>
@@ -21424,7 +21424,7 @@
                 <w:rFonts w:ascii="Calibri" w:hAnsi="Calibri"/>
                 <w:sz w:val="20"/>
               </w:rPr>
-              <w:t>0 %</w:t>
+              <w:t>0.00%</w:t>
             </w:r>
           </w:p>
         </w:tc>
@@ -21621,7 +21621,7 @@
                 <w:rFonts w:ascii="Calibri" w:hAnsi="Calibri"/>
                 <w:sz w:val="20"/>
               </w:rPr>
-              <w:t>0 %</w:t>
+              <w:t>0.00%</w:t>
             </w:r>
           </w:p>
         </w:tc>
@@ -21669,7 +21669,7 @@
                 <w:rFonts w:ascii="Calibri" w:hAnsi="Calibri"/>
                 <w:sz w:val="20"/>
               </w:rPr>
-              <w:t>12.50 %</w:t>
+              <w:t>12.50%</w:t>
             </w:r>
           </w:p>
         </w:tc>
@@ -21794,7 +21794,7 @@
                 <w:rFonts w:ascii="Calibri" w:hAnsi="Calibri"/>
                 <w:sz w:val="20"/>
               </w:rPr>
-              <w:t>0 %</w:t>
+              <w:t>0.00%</w:t>
             </w:r>
           </w:p>
         </w:tc>
@@ -21842,7 +21842,7 @@
                 <w:rFonts w:ascii="Calibri" w:hAnsi="Calibri"/>
                 <w:sz w:val="20"/>
               </w:rPr>
-              <w:t>0 %</w:t>
+              <w:t>0.00%</w:t>
             </w:r>
           </w:p>
         </w:tc>
@@ -22055,7 +22055,7 @@
                 <w:rFonts w:ascii="Calibri" w:hAnsi="Calibri"/>
                 <w:sz w:val="20"/>
               </w:rPr>
-              <w:t>0 %</w:t>
+              <w:t>0.00%</w:t>
             </w:r>
           </w:p>
         </w:tc>
@@ -22103,7 +22103,7 @@
                 <w:rFonts w:ascii="Calibri" w:hAnsi="Calibri"/>
                 <w:sz w:val="20"/>
               </w:rPr>
-              <w:t>0.02 %</w:t>
+              <w:t>0.02%</w:t>
             </w:r>
           </w:p>
         </w:tc>
@@ -22228,7 +22228,7 @@
                 <w:rFonts w:ascii="Calibri" w:hAnsi="Calibri"/>
                 <w:sz w:val="20"/>
               </w:rPr>
-              <w:t>0 %</w:t>
+              <w:t>0.00%</w:t>
             </w:r>
           </w:p>
         </w:tc>
@@ -22276,7 +22276,7 @@
                 <w:rFonts w:ascii="Calibri" w:hAnsi="Calibri"/>
                 <w:sz w:val="20"/>
               </w:rPr>
-              <w:t>0 %</w:t>
+              <w:t>0.00%</w:t>
             </w:r>
           </w:p>
         </w:tc>
@@ -22489,7 +22489,7 @@
                 <w:rFonts w:ascii="Calibri" w:hAnsi="Calibri"/>
                 <w:sz w:val="20"/>
               </w:rPr>
-              <w:t>0.07 %</w:t>
+              <w:t>0.07%</w:t>
             </w:r>
           </w:p>
         </w:tc>
@@ -22537,7 +22537,7 @@
                 <w:rFonts w:ascii="Calibri" w:hAnsi="Calibri"/>
                 <w:sz w:val="20"/>
               </w:rPr>
-              <w:t>0.06 %</w:t>
+              <w:t>0.06%</w:t>
             </w:r>
           </w:p>
         </w:tc>
@@ -22662,7 +22662,7 @@
                 <w:rFonts w:ascii="Calibri" w:hAnsi="Calibri"/>
                 <w:sz w:val="20"/>
               </w:rPr>
-              <w:t>0 %</w:t>
+              <w:t>0.00%</w:t>
             </w:r>
           </w:p>
         </w:tc>
@@ -22710,7 +22710,7 @@
                 <w:rFonts w:ascii="Calibri" w:hAnsi="Calibri"/>
                 <w:sz w:val="20"/>
               </w:rPr>
-              <w:t>0 %</w:t>
+              <w:t>0.00%</w:t>
             </w:r>
           </w:p>
         </w:tc>
@@ -22925,7 +22925,7 @@
                 <w:rFonts w:ascii="Calibri" w:hAnsi="Calibri"/>
                 <w:sz w:val="20"/>
               </w:rPr>
-              <w:t>0 %</w:t>
+              <w:t>0.00%</w:t>
             </w:r>
           </w:p>
         </w:tc>
@@ -22973,7 +22973,7 @@
                 <w:rFonts w:ascii="Calibri" w:hAnsi="Calibri"/>
                 <w:sz w:val="20"/>
               </w:rPr>
-              <w:t>0.11 %</w:t>
+              <w:t>0.11%</w:t>
             </w:r>
           </w:p>
         </w:tc>
@@ -23097,7 +23097,7 @@
                 <w:rFonts w:ascii="Calibri" w:hAnsi="Calibri"/>
                 <w:sz w:val="20"/>
               </w:rPr>
-              <w:t>0 %</w:t>
+              <w:t>0.00%</w:t>
             </w:r>
           </w:p>
         </w:tc>
@@ -23145,7 +23145,7 @@
                 <w:rFonts w:ascii="Calibri" w:hAnsi="Calibri"/>
                 <w:sz w:val="20"/>
               </w:rPr>
-              <w:t>0 %</w:t>
+              <w:t>0.00%</w:t>
             </w:r>
           </w:p>
         </w:tc>
@@ -23334,7 +23334,7 @@
                 <w:rFonts w:ascii="Calibri" w:hAnsi="Calibri"/>
                 <w:sz w:val="20"/>
               </w:rPr>
-              <w:t>0 %</w:t>
+              <w:t>0.00%</w:t>
             </w:r>
           </w:p>
         </w:tc>
@@ -23382,7 +23382,7 @@
                 <w:rFonts w:ascii="Calibri" w:hAnsi="Calibri"/>
                 <w:sz w:val="20"/>
               </w:rPr>
-              <w:t>0.03 %</w:t>
+              <w:t>0.03%</w:t>
             </w:r>
           </w:p>
         </w:tc>
@@ -23507,7 +23507,7 @@
                 <w:rFonts w:ascii="Calibri" w:hAnsi="Calibri"/>
                 <w:sz w:val="20"/>
               </w:rPr>
-              <w:t>0 %</w:t>
+              <w:t>0.00%</w:t>
             </w:r>
           </w:p>
         </w:tc>
@@ -23555,7 +23555,7 @@
                 <w:rFonts w:ascii="Calibri" w:hAnsi="Calibri"/>
                 <w:sz w:val="20"/>
               </w:rPr>
-              <w:t>0 %</w:t>
+              <w:t>0.00%</w:t>
             </w:r>
           </w:p>
         </w:tc>
@@ -23766,7 +23766,7 @@
                 <w:rFonts w:ascii="Calibri" w:hAnsi="Calibri"/>
                 <w:sz w:val="20"/>
               </w:rPr>
-              <w:t>0 %</w:t>
+              <w:t>0.00%</w:t>
             </w:r>
           </w:p>
         </w:tc>
@@ -23814,7 +23814,7 @@
                 <w:rFonts w:ascii="Calibri" w:hAnsi="Calibri"/>
                 <w:sz w:val="20"/>
               </w:rPr>
-              <w:t>0.01 %</w:t>
+              <w:t>0.01%</w:t>
             </w:r>
           </w:p>
         </w:tc>

</xml_diff>

<commit_message>
fix(automation): display '< 0.01%' instead of '0.00%' when N > 0 but rate < 0.005%
</commit_message>
<xml_diff>
--- a/App J-003_Annex C_Preventive and corrective actions list..docx
+++ b/App J-003_Annex C_Preventive and corrective actions list..docx
@@ -13101,7 +13101,7 @@
                 <w:rFonts w:ascii="Calibri" w:hAnsi="Calibri"/>
                 <w:sz w:val="20"/>
               </w:rPr>
-              <w:t>0.00%</w:t>
+              <w:t>&lt; 0.01%</w:t>
             </w:r>
           </w:p>
         </w:tc>
@@ -13848,7 +13848,7 @@
                 <w:rFonts w:ascii="Calibri" w:hAnsi="Calibri"/>
                 <w:sz w:val="20"/>
               </w:rPr>
-              <w:t>0.00%</w:t>
+              <w:t>&lt; 0.01%</w:t>
             </w:r>
           </w:p>
         </w:tc>
@@ -14598,7 +14598,7 @@
                 <w:rFonts w:ascii="Calibri" w:hAnsi="Calibri"/>
                 <w:sz w:val="20"/>
               </w:rPr>
-              <w:t>0.00%</w:t>
+              <w:t>&lt; 0.01%</w:t>
             </w:r>
           </w:p>
         </w:tc>
@@ -18882,7 +18882,7 @@
                 <w:rFonts w:ascii="Calibri" w:hAnsi="Calibri"/>
                 <w:sz w:val="20"/>
               </w:rPr>
-              <w:t>0.00%</w:t>
+              <w:t>&lt; 0.01%</w:t>
             </w:r>
           </w:p>
         </w:tc>
@@ -19462,7 +19462,7 @@
                 <w:rFonts w:ascii="Calibri" w:hAnsi="Calibri"/>
                 <w:sz w:val="20"/>
               </w:rPr>
-              <w:t>0.00%</w:t>
+              <w:t>&lt; 0.01%</w:t>
             </w:r>
           </w:p>
         </w:tc>

</xml_diff>

<commit_message>
feat(automation): dynamically omit/delete model groups from Table 20/Annex C Table 1 if all N for 2022-2025 are 0
</commit_message>
<xml_diff>
--- a/App J-003_Annex C_Preventive and corrective actions list..docx
+++ b/App J-003_Annex C_Preventive and corrective actions list..docx
@@ -13646,7 +13646,7 @@
                 <w:sz w:val="24"/>
                 <w:lang w:eastAsia="zh-TW"/>
               </w:rPr>
-              <w:t>471987540RestorationKR</w:t>
+              <w:t>471987540AbutmentVC</w:t>
             </w:r>
           </w:p>
           <w:p>
@@ -13676,7 +13676,7 @@
                 <w:sz w:val="24"/>
                 <w:lang w:eastAsia="zh-TW"/>
               </w:rPr>
-              <w:t>BSMURT000000A</w:t>
+              <w:t>4AA-D19</w:t>
             </w:r>
           </w:p>
         </w:tc>
@@ -13701,7 +13701,7 @@
                 <w:sz w:val="24"/>
                 <w:lang w:eastAsia="zh-TW"/>
               </w:rPr>
-              <w:t>A1202 - Decoupling</w:t>
+              <w:t>A010103 - Inadequacy of Device Shape and/or Size</w:t>
             </w:r>
           </w:p>
         </w:tc>
@@ -13752,7 +13752,7 @@
                 <w:sz w:val="24"/>
                 <w:lang w:eastAsia="zh-TW"/>
               </w:rPr>
-              <w:t xml:space="preserve"> (2021)</w:t>
+              <w:t xml:space="preserve"> (2022)</w:t>
             </w:r>
           </w:p>
         </w:tc>
@@ -13848,7 +13848,7 @@
                 <w:rFonts w:ascii="Calibri" w:hAnsi="Calibri"/>
                 <w:sz w:val="20"/>
               </w:rPr>
-              <w:t>&lt; 0.01%</w:t>
+              <w:t>0.01%</w:t>
             </w:r>
           </w:p>
         </w:tc>
@@ -13879,173 +13879,6 @@
         </w:tc>
       </w:tr>
       <w:tr>
-        <w:tc>
-          <w:tcPr>
-            <w:tcW w:w="2704" w:type="dxa"/>
-            <w:vMerge/>
-          </w:tcPr>
-          <w:p>
-            <w:pPr>
-              <w:spacing w:after="0" w:line="240" w:lineRule="atLeast"/>
-              <w:jc w:val="center"/>
-              <w:rPr>
-                <w:bCs/>
-                <w:sz w:val="24"/>
-                <w:lang w:eastAsia="zh-TW"/>
-              </w:rPr>
-            </w:pPr>
-          </w:p>
-        </w:tc>
-        <w:tc>
-          <w:tcPr>
-            <w:tcW w:w="3391" w:type="dxa"/>
-          </w:tcPr>
-          <w:p>
-            <w:pPr>
-              <w:spacing w:after="0" w:line="240" w:lineRule="atLeast"/>
-              <w:jc w:val="center"/>
-              <w:rPr>
-                <w:bCs/>
-                <w:sz w:val="24"/>
-                <w:lang w:eastAsia="zh-TW"/>
-              </w:rPr>
-            </w:pPr>
-            <w:r>
-              <w:rPr>
-                <w:bCs/>
-                <w:sz w:val="24"/>
-                <w:lang w:eastAsia="zh-TW"/>
-              </w:rPr>
-              <w:t>Year</w:t>
-            </w:r>
-            <w:r>
-              <w:rPr>
-                <w:bCs/>
-                <w:sz w:val="24"/>
-                <w:lang w:eastAsia="zh-TW"/>
-              </w:rPr>
-              <w:t xml:space="preserve"> (2022)</w:t>
-            </w:r>
-          </w:p>
-        </w:tc>
-        <w:tc>
-          <w:tcPr>
-            <w:tcW w:w="993" w:type="dxa"/>
-          </w:tcPr>
-          <w:p>
-            <w:pPr>
-              <w:spacing w:after="0" w:line="276" w:lineRule="auto"/>
-              <w:jc w:val="center"/>
-              <w:rPr>
-                <w:bCs/>
-                <w:sz w:val="24"/>
-                <w:lang w:eastAsia="zh-TW"/>
-              </w:rPr>
-            </w:pPr>
-            <w:r/>
-            <w:r>
-              <w:rPr>
-                <w:rFonts w:ascii="Calibri" w:hAnsi="Calibri"/>
-                <w:sz w:val="20"/>
-              </w:rPr>
-              <w:t>0</w:t>
-            </w:r>
-          </w:p>
-        </w:tc>
-        <w:tc>
-          <w:tcPr>
-            <w:tcW w:w="992" w:type="dxa"/>
-          </w:tcPr>
-          <w:p>
-            <w:pPr>
-              <w:spacing w:after="0" w:line="276" w:lineRule="auto"/>
-              <w:jc w:val="center"/>
-              <w:rPr>
-                <w:bCs/>
-                <w:sz w:val="24"/>
-                <w:lang w:eastAsia="zh-TW"/>
-              </w:rPr>
-            </w:pPr>
-            <w:r/>
-            <w:r>
-              <w:rPr>
-                <w:rFonts w:ascii="Calibri" w:hAnsi="Calibri"/>
-                <w:sz w:val="20"/>
-              </w:rPr>
-              <w:t>0.00%</w:t>
-            </w:r>
-          </w:p>
-        </w:tc>
-        <w:tc>
-          <w:tcPr>
-            <w:tcW w:w="850" w:type="dxa"/>
-          </w:tcPr>
-          <w:p>
-            <w:pPr>
-              <w:spacing w:after="0" w:line="276" w:lineRule="auto"/>
-              <w:jc w:val="center"/>
-              <w:rPr>
-                <w:bCs/>
-                <w:sz w:val="24"/>
-                <w:lang w:eastAsia="zh-TW"/>
-              </w:rPr>
-            </w:pPr>
-            <w:r/>
-            <w:r>
-              <w:rPr>
-                <w:rFonts w:ascii="Calibri" w:hAnsi="Calibri"/>
-                <w:sz w:val="20"/>
-              </w:rPr>
-              <w:t>0</w:t>
-            </w:r>
-          </w:p>
-        </w:tc>
-        <w:tc>
-          <w:tcPr>
-            <w:tcW w:w="993" w:type="dxa"/>
-          </w:tcPr>
-          <w:p>
-            <w:pPr>
-              <w:spacing w:after="0" w:line="276" w:lineRule="auto"/>
-              <w:jc w:val="center"/>
-              <w:rPr>
-                <w:bCs/>
-                <w:sz w:val="24"/>
-                <w:lang w:eastAsia="zh-TW"/>
-              </w:rPr>
-            </w:pPr>
-            <w:r/>
-            <w:r>
-              <w:rPr>
-                <w:rFonts w:ascii="Calibri" w:hAnsi="Calibri"/>
-                <w:sz w:val="20"/>
-              </w:rPr>
-              <w:t>0.00%</w:t>
-            </w:r>
-          </w:p>
-        </w:tc>
-        <w:tc>
-          <w:tcPr>
-            <w:tcW w:w="1843" w:type="dxa"/>
-            <w:vMerge/>
-          </w:tcPr>
-          <w:p>
-            <w:pPr>
-              <w:spacing w:after="0" w:line="240" w:lineRule="atLeast"/>
-              <w:jc w:val="center"/>
-              <w:rPr>
-                <w:bCs/>
-                <w:sz w:val="24"/>
-                <w:lang w:eastAsia="zh-TW"/>
-              </w:rPr>
-            </w:pPr>
-          </w:p>
-        </w:tc>
-      </w:tr>
-      <w:tr>
-        <w:trPr>
-          <w:trHeight w:val="53"/>
-        </w:trPr>
         <w:tc>
           <w:tcPr>
             <w:tcW w:w="2704" w:type="dxa"/>
@@ -14396,7 +14229,25 @@
                 <w:sz w:val="24"/>
                 <w:lang w:eastAsia="zh-TW"/>
               </w:rPr>
-              <w:t>471987540AbutmentVC</w:t>
+              <w:t>471987540Surgical(</w:t>
+            </w:r>
+            <w:proofErr w:type="spellStart"/>
+            <w:r>
+              <w:rPr>
+                <w:bCs/>
+                <w:sz w:val="24"/>
+                <w:lang w:eastAsia="zh-TW"/>
+              </w:rPr>
+              <w:t>IIa</w:t>
+            </w:r>
+            <w:proofErr w:type="spellEnd"/>
+            <w:r>
+              <w:rPr>
+                <w:bCs/>
+                <w:sz w:val="24"/>
+                <w:lang w:eastAsia="zh-TW"/>
+              </w:rPr>
+              <w:t>)FP</w:t>
             </w:r>
           </w:p>
           <w:p>
@@ -14426,7 +14277,7 @@
                 <w:sz w:val="24"/>
                 <w:lang w:eastAsia="zh-TW"/>
               </w:rPr>
-              <w:t>4AA-D17</w:t>
+              <w:t>3AA-N24</w:t>
             </w:r>
           </w:p>
         </w:tc>
@@ -14451,7 +14302,7 @@
                 <w:sz w:val="24"/>
                 <w:lang w:eastAsia="zh-TW"/>
               </w:rPr>
-              <w:t>A020102 - Nonstandard Device</w:t>
+              <w:t>A040101 - Fracture</w:t>
             </w:r>
           </w:p>
         </w:tc>
@@ -14502,7 +14353,7 @@
                 <w:sz w:val="24"/>
                 <w:lang w:eastAsia="zh-TW"/>
               </w:rPr>
-              <w:t xml:space="preserve"> (2021)</w:t>
+              <w:t xml:space="preserve"> (2022)</w:t>
             </w:r>
           </w:p>
         </w:tc>
@@ -14598,7 +14449,7 @@
                 <w:rFonts w:ascii="Calibri" w:hAnsi="Calibri"/>
                 <w:sz w:val="20"/>
               </w:rPr>
-              <w:t>&lt; 0.01%</w:t>
+              <w:t>0.06%</w:t>
             </w:r>
           </w:p>
         </w:tc>
@@ -14674,7 +14525,7 @@
                 <w:sz w:val="24"/>
                 <w:lang w:eastAsia="zh-TW"/>
               </w:rPr>
-              <w:t xml:space="preserve"> (2022)</w:t>
+              <w:t xml:space="preserve"> (2023)</w:t>
             </w:r>
           </w:p>
         </w:tc>
@@ -14838,7 +14689,7 @@
                 <w:sz w:val="24"/>
                 <w:lang w:eastAsia="zh-TW"/>
               </w:rPr>
-              <w:t xml:space="preserve"> (2023)</w:t>
+              <w:t xml:space="preserve"> (2024)</w:t>
             </w:r>
           </w:p>
         </w:tc>
@@ -14960,7 +14811,7 @@
         <w:tc>
           <w:tcPr>
             <w:tcW w:w="2704" w:type="dxa"/>
-            <w:vMerge/>
+            <w:vMerge w:val="restart"/>
           </w:tcPr>
           <w:p>
             <w:pPr>
@@ -14972,12 +14823,33 @@
                 <w:lang w:eastAsia="zh-TW"/>
               </w:rPr>
             </w:pPr>
-          </w:p>
-        </w:tc>
-        <w:tc>
-          <w:tcPr>
-            <w:tcW w:w="3391" w:type="dxa"/>
-          </w:tcPr>
+            <w:r>
+              <w:rPr>
+                <w:bCs/>
+                <w:sz w:val="24"/>
+                <w:lang w:eastAsia="zh-TW"/>
+              </w:rPr>
+              <w:t>471987540Surgical(</w:t>
+            </w:r>
+            <w:proofErr w:type="spellStart"/>
+            <w:r>
+              <w:rPr>
+                <w:bCs/>
+                <w:sz w:val="24"/>
+                <w:lang w:eastAsia="zh-TW"/>
+              </w:rPr>
+              <w:t>IIa</w:t>
+            </w:r>
+            <w:proofErr w:type="spellEnd"/>
+            <w:r>
+              <w:rPr>
+                <w:bCs/>
+                <w:sz w:val="24"/>
+                <w:lang w:eastAsia="zh-TW"/>
+              </w:rPr>
+              <w:t>)FP</w:t>
+            </w:r>
+          </w:p>
           <w:p>
             <w:pPr>
               <w:spacing w:after="0" w:line="240" w:lineRule="atLeast"/>
@@ -14994,174 +14866,6 @@
                 <w:sz w:val="24"/>
                 <w:lang w:eastAsia="zh-TW"/>
               </w:rPr>
-              <w:t>Year</w:t>
-            </w:r>
-            <w:r>
-              <w:rPr>
-                <w:bCs/>
-                <w:sz w:val="24"/>
-                <w:lang w:eastAsia="zh-TW"/>
-              </w:rPr>
-              <w:t xml:space="preserve"> (2024)</w:t>
-            </w:r>
-          </w:p>
-        </w:tc>
-        <w:tc>
-          <w:tcPr>
-            <w:tcW w:w="993" w:type="dxa"/>
-          </w:tcPr>
-          <w:p>
-            <w:pPr>
-              <w:spacing w:after="0" w:line="276" w:lineRule="auto"/>
-              <w:jc w:val="center"/>
-              <w:rPr>
-                <w:bCs/>
-                <w:sz w:val="24"/>
-                <w:lang w:eastAsia="zh-TW"/>
-              </w:rPr>
-            </w:pPr>
-            <w:r/>
-            <w:r>
-              <w:rPr>
-                <w:rFonts w:ascii="Calibri" w:hAnsi="Calibri"/>
-                <w:sz w:val="20"/>
-              </w:rPr>
-              <w:t>0</w:t>
-            </w:r>
-          </w:p>
-        </w:tc>
-        <w:tc>
-          <w:tcPr>
-            <w:tcW w:w="992" w:type="dxa"/>
-          </w:tcPr>
-          <w:p>
-            <w:pPr>
-              <w:spacing w:after="0" w:line="276" w:lineRule="auto"/>
-              <w:jc w:val="center"/>
-              <w:rPr>
-                <w:bCs/>
-                <w:sz w:val="24"/>
-                <w:lang w:eastAsia="zh-TW"/>
-              </w:rPr>
-            </w:pPr>
-            <w:r/>
-            <w:r>
-              <w:rPr>
-                <w:rFonts w:ascii="Calibri" w:hAnsi="Calibri"/>
-                <w:sz w:val="20"/>
-              </w:rPr>
-              <w:t>0.00%</w:t>
-            </w:r>
-          </w:p>
-        </w:tc>
-        <w:tc>
-          <w:tcPr>
-            <w:tcW w:w="850" w:type="dxa"/>
-          </w:tcPr>
-          <w:p>
-            <w:pPr>
-              <w:spacing w:after="0" w:line="276" w:lineRule="auto"/>
-              <w:jc w:val="center"/>
-              <w:rPr>
-                <w:bCs/>
-                <w:sz w:val="24"/>
-                <w:lang w:eastAsia="zh-TW"/>
-              </w:rPr>
-            </w:pPr>
-            <w:r/>
-            <w:r>
-              <w:rPr>
-                <w:rFonts w:ascii="Calibri" w:hAnsi="Calibri"/>
-                <w:sz w:val="20"/>
-              </w:rPr>
-              <w:t>0</w:t>
-            </w:r>
-          </w:p>
-        </w:tc>
-        <w:tc>
-          <w:tcPr>
-            <w:tcW w:w="993" w:type="dxa"/>
-          </w:tcPr>
-          <w:p>
-            <w:pPr>
-              <w:spacing w:after="0" w:line="276" w:lineRule="auto"/>
-              <w:jc w:val="center"/>
-              <w:rPr>
-                <w:bCs/>
-                <w:sz w:val="24"/>
-                <w:lang w:eastAsia="zh-TW"/>
-              </w:rPr>
-            </w:pPr>
-            <w:r/>
-            <w:r>
-              <w:rPr>
-                <w:rFonts w:ascii="Calibri" w:hAnsi="Calibri"/>
-                <w:sz w:val="20"/>
-              </w:rPr>
-              <w:t>0.00%</w:t>
-            </w:r>
-          </w:p>
-        </w:tc>
-        <w:tc>
-          <w:tcPr>
-            <w:tcW w:w="1843" w:type="dxa"/>
-            <w:vMerge/>
-          </w:tcPr>
-          <w:p>
-            <w:pPr>
-              <w:spacing w:after="0" w:line="240" w:lineRule="atLeast"/>
-              <w:jc w:val="center"/>
-              <w:rPr>
-                <w:bCs/>
-                <w:sz w:val="24"/>
-                <w:lang w:eastAsia="zh-TW"/>
-              </w:rPr>
-            </w:pPr>
-          </w:p>
-        </w:tc>
-      </w:tr>
-      <w:tr>
-        <w:tc>
-          <w:tcPr>
-            <w:tcW w:w="2704" w:type="dxa"/>
-            <w:vMerge w:val="restart"/>
-            <w:vAlign w:val="center"/>
-          </w:tcPr>
-          <w:p>
-            <w:pPr>
-              <w:spacing w:after="0" w:line="240" w:lineRule="atLeast"/>
-              <w:jc w:val="center"/>
-              <w:rPr>
-                <w:bCs/>
-                <w:sz w:val="24"/>
-                <w:lang w:eastAsia="zh-TW"/>
-              </w:rPr>
-            </w:pPr>
-            <w:r>
-              <w:rPr>
-                <w:bCs/>
-                <w:sz w:val="24"/>
-                <w:lang w:eastAsia="zh-TW"/>
-              </w:rPr>
-              <w:t>471987540AbutmentVC</w:t>
-            </w:r>
-          </w:p>
-          <w:p>
-            <w:pPr>
-              <w:spacing w:after="0" w:line="240" w:lineRule="atLeast"/>
-              <w:jc w:val="center"/>
-              <w:rPr>
-                <w:bCs/>
-                <w:sz w:val="24"/>
-                <w:lang w:eastAsia="zh-TW"/>
-              </w:rPr>
-            </w:pPr>
-            <w:r>
-              <w:rPr>
-                <w:bCs/>
-                <w:sz w:val="24"/>
-                <w:lang w:eastAsia="zh-TW"/>
-              </w:rPr>
               <w:t>/</w:t>
             </w:r>
             <w:r>
@@ -15173,7 +14877,7 @@
                 <w:sz w:val="24"/>
                 <w:lang w:eastAsia="zh-TW"/>
               </w:rPr>
-              <w:t>4AA-D19</w:t>
+              <w:t>3AA-N06</w:t>
             </w:r>
           </w:p>
         </w:tc>
@@ -15198,7 +14902,7 @@
                 <w:sz w:val="24"/>
                 <w:lang w:eastAsia="zh-TW"/>
               </w:rPr>
-              <w:t>A010103 - Inadequacy of Device Shape and/or Size</w:t>
+              <w:t>A020101 - Dull, Blunt</w:t>
             </w:r>
           </w:p>
         </w:tc>
@@ -15345,1780 +15049,7 @@
                 <w:rFonts w:ascii="Calibri" w:hAnsi="Calibri"/>
                 <w:sz w:val="20"/>
               </w:rPr>
-              <w:t>0.01%</w:t>
-            </w:r>
-          </w:p>
-        </w:tc>
-        <w:tc>
-          <w:tcPr>
-            <w:tcW w:w="1843" w:type="dxa"/>
-            <w:vMerge w:val="restart"/>
-          </w:tcPr>
-          <w:p>
-            <w:pPr>
-              <w:spacing w:after="0" w:line="240" w:lineRule="atLeast"/>
-              <w:jc w:val="center"/>
-              <w:rPr>
-                <w:bCs/>
-                <w:sz w:val="24"/>
-                <w:lang w:eastAsia="zh-TW"/>
-              </w:rPr>
-            </w:pPr>
-            <w:r>
-              <w:rPr>
-                <w:bCs/>
-                <w:sz w:val="24"/>
-                <w:lang w:eastAsia="zh-TW"/>
-              </w:rPr>
-              <w:t>No recurrence</w:t>
-            </w:r>
-          </w:p>
-        </w:tc>
-      </w:tr>
-      <w:tr>
-        <w:tc>
-          <w:tcPr>
-            <w:tcW w:w="2704" w:type="dxa"/>
-            <w:vMerge/>
-          </w:tcPr>
-          <w:p>
-            <w:pPr>
-              <w:spacing w:after="0" w:line="240" w:lineRule="atLeast"/>
-              <w:jc w:val="center"/>
-              <w:rPr>
-                <w:bCs/>
-                <w:sz w:val="24"/>
-                <w:lang w:eastAsia="zh-TW"/>
-              </w:rPr>
-            </w:pPr>
-          </w:p>
-        </w:tc>
-        <w:tc>
-          <w:tcPr>
-            <w:tcW w:w="3391" w:type="dxa"/>
-          </w:tcPr>
-          <w:p>
-            <w:pPr>
-              <w:spacing w:after="0" w:line="240" w:lineRule="atLeast"/>
-              <w:jc w:val="center"/>
-              <w:rPr>
-                <w:bCs/>
-                <w:sz w:val="24"/>
-                <w:lang w:eastAsia="zh-TW"/>
-              </w:rPr>
-            </w:pPr>
-            <w:r>
-              <w:rPr>
-                <w:bCs/>
-                <w:sz w:val="24"/>
-                <w:lang w:eastAsia="zh-TW"/>
-              </w:rPr>
-              <w:t>Year</w:t>
-            </w:r>
-            <w:r>
-              <w:rPr>
-                <w:bCs/>
-                <w:sz w:val="24"/>
-                <w:lang w:eastAsia="zh-TW"/>
-              </w:rPr>
-              <w:t xml:space="preserve"> (2023)</w:t>
-            </w:r>
-          </w:p>
-        </w:tc>
-        <w:tc>
-          <w:tcPr>
-            <w:tcW w:w="993" w:type="dxa"/>
-          </w:tcPr>
-          <w:p>
-            <w:pPr>
-              <w:spacing w:after="0" w:line="276" w:lineRule="auto"/>
-              <w:jc w:val="center"/>
-              <w:rPr>
-                <w:bCs/>
-                <w:sz w:val="24"/>
-                <w:lang w:eastAsia="zh-TW"/>
-              </w:rPr>
-            </w:pPr>
-            <w:r/>
-            <w:r>
-              <w:rPr>
-                <w:rFonts w:ascii="Calibri" w:hAnsi="Calibri"/>
-                <w:sz w:val="20"/>
-              </w:rPr>
-              <w:t>0</w:t>
-            </w:r>
-          </w:p>
-        </w:tc>
-        <w:tc>
-          <w:tcPr>
-            <w:tcW w:w="992" w:type="dxa"/>
-          </w:tcPr>
-          <w:p>
-            <w:pPr>
-              <w:spacing w:after="0" w:line="276" w:lineRule="auto"/>
-              <w:jc w:val="center"/>
-              <w:rPr>
-                <w:bCs/>
-                <w:sz w:val="24"/>
-                <w:lang w:eastAsia="zh-TW"/>
-              </w:rPr>
-            </w:pPr>
-            <w:r/>
-            <w:r>
-              <w:rPr>
-                <w:rFonts w:ascii="Calibri" w:hAnsi="Calibri"/>
-                <w:sz w:val="20"/>
-              </w:rPr>
-              <w:t>0.00%</w:t>
-            </w:r>
-          </w:p>
-        </w:tc>
-        <w:tc>
-          <w:tcPr>
-            <w:tcW w:w="850" w:type="dxa"/>
-          </w:tcPr>
-          <w:p>
-            <w:pPr>
-              <w:spacing w:after="0" w:line="276" w:lineRule="auto"/>
-              <w:jc w:val="center"/>
-              <w:rPr>
-                <w:bCs/>
-                <w:sz w:val="24"/>
-                <w:lang w:eastAsia="zh-TW"/>
-              </w:rPr>
-            </w:pPr>
-            <w:r/>
-            <w:r>
-              <w:rPr>
-                <w:rFonts w:ascii="Calibri" w:hAnsi="Calibri"/>
-                <w:sz w:val="20"/>
-              </w:rPr>
-              <w:t>0</w:t>
-            </w:r>
-          </w:p>
-        </w:tc>
-        <w:tc>
-          <w:tcPr>
-            <w:tcW w:w="993" w:type="dxa"/>
-          </w:tcPr>
-          <w:p>
-            <w:pPr>
-              <w:spacing w:after="0" w:line="276" w:lineRule="auto"/>
-              <w:jc w:val="center"/>
-              <w:rPr>
-                <w:bCs/>
-                <w:sz w:val="24"/>
-                <w:lang w:eastAsia="zh-TW"/>
-              </w:rPr>
-            </w:pPr>
-            <w:r/>
-            <w:r>
-              <w:rPr>
-                <w:rFonts w:ascii="Calibri" w:hAnsi="Calibri"/>
-                <w:sz w:val="20"/>
-              </w:rPr>
-              <w:t>0.00%</w:t>
-            </w:r>
-          </w:p>
-        </w:tc>
-        <w:tc>
-          <w:tcPr>
-            <w:tcW w:w="1843" w:type="dxa"/>
-            <w:vMerge/>
-          </w:tcPr>
-          <w:p>
-            <w:pPr>
-              <w:spacing w:after="0" w:line="240" w:lineRule="atLeast"/>
-              <w:jc w:val="center"/>
-              <w:rPr>
-                <w:bCs/>
-                <w:sz w:val="24"/>
-                <w:lang w:eastAsia="zh-TW"/>
-              </w:rPr>
-            </w:pPr>
-          </w:p>
-        </w:tc>
-      </w:tr>
-      <w:tr>
-        <w:tc>
-          <w:tcPr>
-            <w:tcW w:w="2704" w:type="dxa"/>
-            <w:vMerge/>
-          </w:tcPr>
-          <w:p>
-            <w:pPr>
-              <w:spacing w:after="0" w:line="240" w:lineRule="atLeast"/>
-              <w:jc w:val="center"/>
-              <w:rPr>
-                <w:bCs/>
-                <w:sz w:val="24"/>
-                <w:lang w:eastAsia="zh-TW"/>
-              </w:rPr>
-            </w:pPr>
-          </w:p>
-        </w:tc>
-        <w:tc>
-          <w:tcPr>
-            <w:tcW w:w="3391" w:type="dxa"/>
-          </w:tcPr>
-          <w:p>
-            <w:pPr>
-              <w:spacing w:after="0" w:line="240" w:lineRule="atLeast"/>
-              <w:jc w:val="center"/>
-              <w:rPr>
-                <w:bCs/>
-                <w:sz w:val="24"/>
-                <w:lang w:eastAsia="zh-TW"/>
-              </w:rPr>
-            </w:pPr>
-            <w:r>
-              <w:rPr>
-                <w:bCs/>
-                <w:sz w:val="24"/>
-                <w:lang w:eastAsia="zh-TW"/>
-              </w:rPr>
-              <w:t>Year</w:t>
-            </w:r>
-            <w:r>
-              <w:rPr>
-                <w:bCs/>
-                <w:sz w:val="24"/>
-                <w:lang w:eastAsia="zh-TW"/>
-              </w:rPr>
-              <w:t xml:space="preserve"> (2024)</w:t>
-            </w:r>
-          </w:p>
-        </w:tc>
-        <w:tc>
-          <w:tcPr>
-            <w:tcW w:w="993" w:type="dxa"/>
-          </w:tcPr>
-          <w:p>
-            <w:pPr>
-              <w:spacing w:after="0" w:line="276" w:lineRule="auto"/>
-              <w:jc w:val="center"/>
-              <w:rPr>
-                <w:bCs/>
-                <w:sz w:val="24"/>
-                <w:lang w:eastAsia="zh-TW"/>
-              </w:rPr>
-            </w:pPr>
-            <w:r/>
-            <w:r>
-              <w:rPr>
-                <w:rFonts w:ascii="Calibri" w:hAnsi="Calibri"/>
-                <w:sz w:val="20"/>
-              </w:rPr>
-              <w:t>0</w:t>
-            </w:r>
-          </w:p>
-        </w:tc>
-        <w:tc>
-          <w:tcPr>
-            <w:tcW w:w="992" w:type="dxa"/>
-          </w:tcPr>
-          <w:p>
-            <w:pPr>
-              <w:spacing w:after="0" w:line="276" w:lineRule="auto"/>
-              <w:jc w:val="center"/>
-              <w:rPr>
-                <w:bCs/>
-                <w:sz w:val="24"/>
-                <w:lang w:eastAsia="zh-TW"/>
-              </w:rPr>
-            </w:pPr>
-            <w:r/>
-            <w:r>
-              <w:rPr>
-                <w:rFonts w:ascii="Calibri" w:hAnsi="Calibri"/>
-                <w:sz w:val="20"/>
-              </w:rPr>
-              <w:t>0.00%</w:t>
-            </w:r>
-          </w:p>
-        </w:tc>
-        <w:tc>
-          <w:tcPr>
-            <w:tcW w:w="850" w:type="dxa"/>
-          </w:tcPr>
-          <w:p>
-            <w:pPr>
-              <w:spacing w:after="0" w:line="276" w:lineRule="auto"/>
-              <w:jc w:val="center"/>
-              <w:rPr>
-                <w:bCs/>
-                <w:sz w:val="24"/>
-                <w:lang w:eastAsia="zh-TW"/>
-              </w:rPr>
-            </w:pPr>
-            <w:r/>
-            <w:r>
-              <w:rPr>
-                <w:rFonts w:ascii="Calibri" w:hAnsi="Calibri"/>
-                <w:sz w:val="20"/>
-              </w:rPr>
-              <w:t>0</w:t>
-            </w:r>
-          </w:p>
-        </w:tc>
-        <w:tc>
-          <w:tcPr>
-            <w:tcW w:w="993" w:type="dxa"/>
-          </w:tcPr>
-          <w:p>
-            <w:pPr>
-              <w:spacing w:after="0" w:line="276" w:lineRule="auto"/>
-              <w:jc w:val="center"/>
-              <w:rPr>
-                <w:bCs/>
-                <w:sz w:val="24"/>
-                <w:lang w:eastAsia="zh-TW"/>
-              </w:rPr>
-            </w:pPr>
-            <w:r/>
-            <w:r>
-              <w:rPr>
-                <w:rFonts w:ascii="Calibri" w:hAnsi="Calibri"/>
-                <w:sz w:val="20"/>
-              </w:rPr>
-              <w:t>0.00%</w:t>
-            </w:r>
-          </w:p>
-        </w:tc>
-        <w:tc>
-          <w:tcPr>
-            <w:tcW w:w="1843" w:type="dxa"/>
-            <w:vMerge/>
-          </w:tcPr>
-          <w:p>
-            <w:pPr>
-              <w:spacing w:after="0" w:line="240" w:lineRule="atLeast"/>
-              <w:jc w:val="center"/>
-              <w:rPr>
-                <w:bCs/>
-                <w:sz w:val="24"/>
-                <w:lang w:eastAsia="zh-TW"/>
-              </w:rPr>
-            </w:pPr>
-          </w:p>
-        </w:tc>
-      </w:tr>
-      <w:tr>
-        <w:tc>
-          <w:tcPr>
-            <w:tcW w:w="2704" w:type="dxa"/>
-            <w:vMerge w:val="restart"/>
-            <w:vAlign w:val="center"/>
-          </w:tcPr>
-          <w:p>
-            <w:pPr>
-              <w:spacing w:after="0" w:line="240" w:lineRule="atLeast"/>
-              <w:jc w:val="center"/>
-              <w:rPr>
-                <w:bCs/>
-                <w:sz w:val="24"/>
-                <w:lang w:eastAsia="zh-TW"/>
-              </w:rPr>
-            </w:pPr>
-            <w:r>
-              <w:rPr>
-                <w:bCs/>
-                <w:sz w:val="24"/>
-                <w:lang w:eastAsia="zh-TW"/>
-              </w:rPr>
-              <w:t>471987540Surgical(</w:t>
-            </w:r>
-            <w:proofErr w:type="spellStart"/>
-            <w:r>
-              <w:rPr>
-                <w:bCs/>
-                <w:sz w:val="24"/>
-                <w:lang w:eastAsia="zh-TW"/>
-              </w:rPr>
-              <w:t>IIa</w:t>
-            </w:r>
-            <w:proofErr w:type="spellEnd"/>
-            <w:r>
-              <w:rPr>
-                <w:bCs/>
-                <w:sz w:val="24"/>
-                <w:lang w:eastAsia="zh-TW"/>
-              </w:rPr>
-              <w:t>)FP</w:t>
-            </w:r>
-          </w:p>
-          <w:p>
-            <w:pPr>
-              <w:spacing w:after="0" w:line="240" w:lineRule="atLeast"/>
-              <w:jc w:val="center"/>
-              <w:rPr>
-                <w:bCs/>
-                <w:sz w:val="24"/>
-                <w:lang w:eastAsia="zh-TW"/>
-              </w:rPr>
-            </w:pPr>
-            <w:r>
-              <w:rPr>
-                <w:bCs/>
-                <w:sz w:val="24"/>
-                <w:lang w:eastAsia="zh-TW"/>
-              </w:rPr>
-              <w:t>/</w:t>
-            </w:r>
-            <w:r>
-              <w:t xml:space="preserve"> </w:t>
-            </w:r>
-            <w:r>
-              <w:rPr>
-                <w:bCs/>
-                <w:sz w:val="24"/>
-                <w:lang w:eastAsia="zh-TW"/>
-              </w:rPr>
-              <w:t>3AA-N24</w:t>
-            </w:r>
-          </w:p>
-        </w:tc>
-        <w:tc>
-          <w:tcPr>
-            <w:tcW w:w="9062" w:type="dxa"/>
-            <w:gridSpan w:val="6"/>
-            <w:shd w:val="clear" w:color="auto" w:fill="EAF1DD" w:themeFill="accent3" w:themeFillTint="33"/>
-          </w:tcPr>
-          <w:p>
-            <w:pPr>
-              <w:spacing w:after="0" w:line="240" w:lineRule="atLeast"/>
-              <w:rPr>
-                <w:bCs/>
-                <w:sz w:val="24"/>
-                <w:lang w:eastAsia="zh-TW"/>
-              </w:rPr>
-            </w:pPr>
-            <w:r>
-              <w:rPr>
-                <w:bCs/>
-                <w:sz w:val="24"/>
-                <w:lang w:eastAsia="zh-TW"/>
-              </w:rPr>
-              <w:t>A040101 - Fracture</w:t>
-            </w:r>
-          </w:p>
-        </w:tc>
-      </w:tr>
-      <w:tr>
-        <w:tc>
-          <w:tcPr>
-            <w:tcW w:w="2704" w:type="dxa"/>
-            <w:vMerge/>
-          </w:tcPr>
-          <w:p>
-            <w:pPr>
-              <w:spacing w:after="0" w:line="240" w:lineRule="atLeast"/>
-              <w:jc w:val="center"/>
-              <w:rPr>
-                <w:bCs/>
-                <w:sz w:val="24"/>
-                <w:lang w:eastAsia="zh-TW"/>
-              </w:rPr>
-            </w:pPr>
-          </w:p>
-        </w:tc>
-        <w:tc>
-          <w:tcPr>
-            <w:tcW w:w="3391" w:type="dxa"/>
-          </w:tcPr>
-          <w:p>
-            <w:pPr>
-              <w:spacing w:after="0" w:line="240" w:lineRule="atLeast"/>
-              <w:jc w:val="center"/>
-              <w:rPr>
-                <w:bCs/>
-                <w:sz w:val="24"/>
-                <w:lang w:eastAsia="zh-TW"/>
-              </w:rPr>
-            </w:pPr>
-            <w:r>
-              <w:rPr>
-                <w:bCs/>
-                <w:sz w:val="24"/>
-                <w:lang w:eastAsia="zh-TW"/>
-              </w:rPr>
-              <w:t>Year</w:t>
-            </w:r>
-            <w:r>
-              <w:rPr>
-                <w:bCs/>
-                <w:sz w:val="24"/>
-                <w:lang w:eastAsia="zh-TW"/>
-              </w:rPr>
-              <w:t xml:space="preserve"> (2022)</w:t>
-            </w:r>
-          </w:p>
-        </w:tc>
-        <w:tc>
-          <w:tcPr>
-            <w:tcW w:w="993" w:type="dxa"/>
-          </w:tcPr>
-          <w:p>
-            <w:pPr>
-              <w:spacing w:after="0" w:line="276" w:lineRule="auto"/>
-              <w:jc w:val="center"/>
-              <w:rPr>
-                <w:bCs/>
-                <w:sz w:val="24"/>
-                <w:lang w:eastAsia="zh-TW"/>
-              </w:rPr>
-            </w:pPr>
-            <w:r/>
-            <w:r>
-              <w:rPr>
-                <w:rFonts w:ascii="Calibri" w:hAnsi="Calibri"/>
-                <w:sz w:val="20"/>
-              </w:rPr>
-              <w:t>0</w:t>
-            </w:r>
-          </w:p>
-        </w:tc>
-        <w:tc>
-          <w:tcPr>
-            <w:tcW w:w="992" w:type="dxa"/>
-          </w:tcPr>
-          <w:p>
-            <w:pPr>
-              <w:spacing w:after="0" w:line="276" w:lineRule="auto"/>
-              <w:jc w:val="center"/>
-              <w:rPr>
-                <w:bCs/>
-                <w:sz w:val="24"/>
-                <w:lang w:eastAsia="zh-TW"/>
-              </w:rPr>
-            </w:pPr>
-            <w:r/>
-            <w:r>
-              <w:rPr>
-                <w:rFonts w:ascii="Calibri" w:hAnsi="Calibri"/>
-                <w:sz w:val="20"/>
-              </w:rPr>
-              <w:t>0.00%</w:t>
-            </w:r>
-          </w:p>
-        </w:tc>
-        <w:tc>
-          <w:tcPr>
-            <w:tcW w:w="850" w:type="dxa"/>
-          </w:tcPr>
-          <w:p>
-            <w:pPr>
-              <w:spacing w:after="0" w:line="276" w:lineRule="auto"/>
-              <w:jc w:val="center"/>
-              <w:rPr>
-                <w:bCs/>
-                <w:sz w:val="24"/>
-                <w:lang w:eastAsia="zh-TW"/>
-              </w:rPr>
-            </w:pPr>
-            <w:r/>
-            <w:r>
-              <w:rPr>
-                <w:rFonts w:ascii="Calibri" w:hAnsi="Calibri"/>
-                <w:sz w:val="20"/>
-              </w:rPr>
-              <w:t>1</w:t>
-            </w:r>
-          </w:p>
-        </w:tc>
-        <w:tc>
-          <w:tcPr>
-            <w:tcW w:w="993" w:type="dxa"/>
-          </w:tcPr>
-          <w:p>
-            <w:pPr>
-              <w:spacing w:after="0" w:line="276" w:lineRule="auto"/>
-              <w:jc w:val="center"/>
-              <w:rPr>
-                <w:bCs/>
-                <w:sz w:val="24"/>
-                <w:lang w:eastAsia="zh-TW"/>
-              </w:rPr>
-            </w:pPr>
-            <w:r/>
-            <w:r>
-              <w:rPr>
-                <w:rFonts w:ascii="Calibri" w:hAnsi="Calibri"/>
-                <w:sz w:val="20"/>
-              </w:rPr>
               <w:t>0.06%</w:t>
-            </w:r>
-          </w:p>
-        </w:tc>
-        <w:tc>
-          <w:tcPr>
-            <w:tcW w:w="1843" w:type="dxa"/>
-            <w:vMerge w:val="restart"/>
-          </w:tcPr>
-          <w:p>
-            <w:pPr>
-              <w:spacing w:after="0" w:line="240" w:lineRule="atLeast"/>
-              <w:jc w:val="center"/>
-              <w:rPr>
-                <w:bCs/>
-                <w:sz w:val="24"/>
-                <w:lang w:eastAsia="zh-TW"/>
-              </w:rPr>
-            </w:pPr>
-            <w:r>
-              <w:rPr>
-                <w:bCs/>
-                <w:sz w:val="24"/>
-                <w:lang w:eastAsia="zh-TW"/>
-              </w:rPr>
-              <w:t>No recurrence</w:t>
-            </w:r>
-          </w:p>
-        </w:tc>
-      </w:tr>
-      <w:tr>
-        <w:tc>
-          <w:tcPr>
-            <w:tcW w:w="2704" w:type="dxa"/>
-            <w:vMerge/>
-          </w:tcPr>
-          <w:p>
-            <w:pPr>
-              <w:spacing w:after="0" w:line="240" w:lineRule="atLeast"/>
-              <w:jc w:val="center"/>
-              <w:rPr>
-                <w:bCs/>
-                <w:sz w:val="24"/>
-                <w:lang w:eastAsia="zh-TW"/>
-              </w:rPr>
-            </w:pPr>
-          </w:p>
-        </w:tc>
-        <w:tc>
-          <w:tcPr>
-            <w:tcW w:w="3391" w:type="dxa"/>
-          </w:tcPr>
-          <w:p>
-            <w:pPr>
-              <w:spacing w:after="0" w:line="240" w:lineRule="atLeast"/>
-              <w:jc w:val="center"/>
-              <w:rPr>
-                <w:bCs/>
-                <w:sz w:val="24"/>
-                <w:lang w:eastAsia="zh-TW"/>
-              </w:rPr>
-            </w:pPr>
-            <w:r>
-              <w:rPr>
-                <w:bCs/>
-                <w:sz w:val="24"/>
-                <w:lang w:eastAsia="zh-TW"/>
-              </w:rPr>
-              <w:t>Year</w:t>
-            </w:r>
-            <w:r>
-              <w:rPr>
-                <w:bCs/>
-                <w:sz w:val="24"/>
-                <w:lang w:eastAsia="zh-TW"/>
-              </w:rPr>
-              <w:t xml:space="preserve"> (2023)</w:t>
-            </w:r>
-          </w:p>
-        </w:tc>
-        <w:tc>
-          <w:tcPr>
-            <w:tcW w:w="993" w:type="dxa"/>
-          </w:tcPr>
-          <w:p>
-            <w:pPr>
-              <w:spacing w:after="0" w:line="276" w:lineRule="auto"/>
-              <w:jc w:val="center"/>
-              <w:rPr>
-                <w:bCs/>
-                <w:sz w:val="24"/>
-                <w:lang w:eastAsia="zh-TW"/>
-              </w:rPr>
-            </w:pPr>
-            <w:r/>
-            <w:r>
-              <w:rPr>
-                <w:rFonts w:ascii="Calibri" w:hAnsi="Calibri"/>
-                <w:sz w:val="20"/>
-              </w:rPr>
-              <w:t>0</w:t>
-            </w:r>
-          </w:p>
-        </w:tc>
-        <w:tc>
-          <w:tcPr>
-            <w:tcW w:w="992" w:type="dxa"/>
-          </w:tcPr>
-          <w:p>
-            <w:pPr>
-              <w:spacing w:after="0" w:line="276" w:lineRule="auto"/>
-              <w:jc w:val="center"/>
-              <w:rPr>
-                <w:bCs/>
-                <w:sz w:val="24"/>
-                <w:lang w:eastAsia="zh-TW"/>
-              </w:rPr>
-            </w:pPr>
-            <w:r/>
-            <w:r>
-              <w:rPr>
-                <w:rFonts w:ascii="Calibri" w:hAnsi="Calibri"/>
-                <w:sz w:val="20"/>
-              </w:rPr>
-              <w:t>0.00%</w:t>
-            </w:r>
-          </w:p>
-        </w:tc>
-        <w:tc>
-          <w:tcPr>
-            <w:tcW w:w="850" w:type="dxa"/>
-          </w:tcPr>
-          <w:p>
-            <w:pPr>
-              <w:spacing w:after="0" w:line="276" w:lineRule="auto"/>
-              <w:jc w:val="center"/>
-              <w:rPr>
-                <w:bCs/>
-                <w:sz w:val="24"/>
-                <w:lang w:eastAsia="zh-TW"/>
-              </w:rPr>
-            </w:pPr>
-            <w:r/>
-            <w:r>
-              <w:rPr>
-                <w:rFonts w:ascii="Calibri" w:hAnsi="Calibri"/>
-                <w:sz w:val="20"/>
-              </w:rPr>
-              <w:t>0</w:t>
-            </w:r>
-          </w:p>
-        </w:tc>
-        <w:tc>
-          <w:tcPr>
-            <w:tcW w:w="993" w:type="dxa"/>
-          </w:tcPr>
-          <w:p>
-            <w:pPr>
-              <w:spacing w:after="0" w:line="276" w:lineRule="auto"/>
-              <w:jc w:val="center"/>
-              <w:rPr>
-                <w:bCs/>
-                <w:sz w:val="24"/>
-                <w:lang w:eastAsia="zh-TW"/>
-              </w:rPr>
-            </w:pPr>
-            <w:r/>
-            <w:r>
-              <w:rPr>
-                <w:rFonts w:ascii="Calibri" w:hAnsi="Calibri"/>
-                <w:sz w:val="20"/>
-              </w:rPr>
-              <w:t>0.00%</w:t>
-            </w:r>
-          </w:p>
-        </w:tc>
-        <w:tc>
-          <w:tcPr>
-            <w:tcW w:w="1843" w:type="dxa"/>
-            <w:vMerge/>
-          </w:tcPr>
-          <w:p>
-            <w:pPr>
-              <w:spacing w:after="0" w:line="240" w:lineRule="atLeast"/>
-              <w:jc w:val="center"/>
-              <w:rPr>
-                <w:bCs/>
-                <w:sz w:val="24"/>
-                <w:lang w:eastAsia="zh-TW"/>
-              </w:rPr>
-            </w:pPr>
-          </w:p>
-        </w:tc>
-      </w:tr>
-      <w:tr>
-        <w:tc>
-          <w:tcPr>
-            <w:tcW w:w="2704" w:type="dxa"/>
-            <w:vMerge/>
-          </w:tcPr>
-          <w:p>
-            <w:pPr>
-              <w:spacing w:after="0" w:line="240" w:lineRule="atLeast"/>
-              <w:jc w:val="center"/>
-              <w:rPr>
-                <w:bCs/>
-                <w:sz w:val="24"/>
-                <w:lang w:eastAsia="zh-TW"/>
-              </w:rPr>
-            </w:pPr>
-          </w:p>
-        </w:tc>
-        <w:tc>
-          <w:tcPr>
-            <w:tcW w:w="3391" w:type="dxa"/>
-          </w:tcPr>
-          <w:p>
-            <w:pPr>
-              <w:spacing w:after="0" w:line="240" w:lineRule="atLeast"/>
-              <w:jc w:val="center"/>
-              <w:rPr>
-                <w:bCs/>
-                <w:sz w:val="24"/>
-                <w:lang w:eastAsia="zh-TW"/>
-              </w:rPr>
-            </w:pPr>
-            <w:r>
-              <w:rPr>
-                <w:bCs/>
-                <w:sz w:val="24"/>
-                <w:lang w:eastAsia="zh-TW"/>
-              </w:rPr>
-              <w:t>Year</w:t>
-            </w:r>
-            <w:r>
-              <w:rPr>
-                <w:bCs/>
-                <w:sz w:val="24"/>
-                <w:lang w:eastAsia="zh-TW"/>
-              </w:rPr>
-              <w:t xml:space="preserve"> (2024)</w:t>
-            </w:r>
-          </w:p>
-        </w:tc>
-        <w:tc>
-          <w:tcPr>
-            <w:tcW w:w="993" w:type="dxa"/>
-          </w:tcPr>
-          <w:p>
-            <w:pPr>
-              <w:spacing w:after="0" w:line="276" w:lineRule="auto"/>
-              <w:jc w:val="center"/>
-              <w:rPr>
-                <w:bCs/>
-                <w:sz w:val="24"/>
-                <w:lang w:eastAsia="zh-TW"/>
-              </w:rPr>
-            </w:pPr>
-            <w:r/>
-            <w:r>
-              <w:rPr>
-                <w:rFonts w:ascii="Calibri" w:hAnsi="Calibri"/>
-                <w:sz w:val="20"/>
-              </w:rPr>
-              <w:t>0</w:t>
-            </w:r>
-          </w:p>
-        </w:tc>
-        <w:tc>
-          <w:tcPr>
-            <w:tcW w:w="992" w:type="dxa"/>
-          </w:tcPr>
-          <w:p>
-            <w:pPr>
-              <w:spacing w:after="0" w:line="276" w:lineRule="auto"/>
-              <w:jc w:val="center"/>
-              <w:rPr>
-                <w:bCs/>
-                <w:sz w:val="24"/>
-                <w:lang w:eastAsia="zh-TW"/>
-              </w:rPr>
-            </w:pPr>
-            <w:r/>
-            <w:r>
-              <w:rPr>
-                <w:rFonts w:ascii="Calibri" w:hAnsi="Calibri"/>
-                <w:sz w:val="20"/>
-              </w:rPr>
-              <w:t>0.00%</w:t>
-            </w:r>
-          </w:p>
-        </w:tc>
-        <w:tc>
-          <w:tcPr>
-            <w:tcW w:w="850" w:type="dxa"/>
-          </w:tcPr>
-          <w:p>
-            <w:pPr>
-              <w:spacing w:after="0" w:line="276" w:lineRule="auto"/>
-              <w:jc w:val="center"/>
-              <w:rPr>
-                <w:bCs/>
-                <w:sz w:val="24"/>
-                <w:lang w:eastAsia="zh-TW"/>
-              </w:rPr>
-            </w:pPr>
-            <w:r/>
-            <w:r>
-              <w:rPr>
-                <w:rFonts w:ascii="Calibri" w:hAnsi="Calibri"/>
-                <w:sz w:val="20"/>
-              </w:rPr>
-              <w:t>0</w:t>
-            </w:r>
-          </w:p>
-        </w:tc>
-        <w:tc>
-          <w:tcPr>
-            <w:tcW w:w="993" w:type="dxa"/>
-          </w:tcPr>
-          <w:p>
-            <w:pPr>
-              <w:spacing w:after="0" w:line="276" w:lineRule="auto"/>
-              <w:jc w:val="center"/>
-              <w:rPr>
-                <w:bCs/>
-                <w:sz w:val="24"/>
-                <w:lang w:eastAsia="zh-TW"/>
-              </w:rPr>
-            </w:pPr>
-            <w:r/>
-            <w:r>
-              <w:rPr>
-                <w:rFonts w:ascii="Calibri" w:hAnsi="Calibri"/>
-                <w:sz w:val="20"/>
-              </w:rPr>
-              <w:t>0.00%</w:t>
-            </w:r>
-          </w:p>
-        </w:tc>
-        <w:tc>
-          <w:tcPr>
-            <w:tcW w:w="1843" w:type="dxa"/>
-            <w:vMerge/>
-          </w:tcPr>
-          <w:p>
-            <w:pPr>
-              <w:spacing w:after="0" w:line="240" w:lineRule="atLeast"/>
-              <w:jc w:val="center"/>
-              <w:rPr>
-                <w:bCs/>
-                <w:sz w:val="24"/>
-                <w:lang w:eastAsia="zh-TW"/>
-              </w:rPr>
-            </w:pPr>
-          </w:p>
-        </w:tc>
-      </w:tr>
-      <w:tr>
-        <w:tc>
-          <w:tcPr>
-            <w:tcW w:w="2704" w:type="dxa"/>
-            <w:vMerge w:val="restart"/>
-          </w:tcPr>
-          <w:p>
-            <w:pPr>
-              <w:spacing w:after="0" w:line="240" w:lineRule="atLeast"/>
-              <w:jc w:val="center"/>
-              <w:rPr>
-                <w:bCs/>
-                <w:sz w:val="24"/>
-                <w:lang w:eastAsia="zh-TW"/>
-              </w:rPr>
-            </w:pPr>
-            <w:r>
-              <w:rPr>
-                <w:bCs/>
-                <w:sz w:val="24"/>
-                <w:lang w:eastAsia="zh-TW"/>
-              </w:rPr>
-              <w:t>471987540Surgical(</w:t>
-            </w:r>
-            <w:proofErr w:type="spellStart"/>
-            <w:r>
-              <w:rPr>
-                <w:bCs/>
-                <w:sz w:val="24"/>
-                <w:lang w:eastAsia="zh-TW"/>
-              </w:rPr>
-              <w:t>IIa</w:t>
-            </w:r>
-            <w:proofErr w:type="spellEnd"/>
-            <w:r>
-              <w:rPr>
-                <w:bCs/>
-                <w:sz w:val="24"/>
-                <w:lang w:eastAsia="zh-TW"/>
-              </w:rPr>
-              <w:t>)FP</w:t>
-            </w:r>
-          </w:p>
-          <w:p>
-            <w:pPr>
-              <w:spacing w:after="0" w:line="240" w:lineRule="atLeast"/>
-              <w:jc w:val="center"/>
-              <w:rPr>
-                <w:bCs/>
-                <w:sz w:val="24"/>
-                <w:lang w:eastAsia="zh-TW"/>
-              </w:rPr>
-            </w:pPr>
-            <w:r>
-              <w:rPr>
-                <w:bCs/>
-                <w:sz w:val="24"/>
-                <w:lang w:eastAsia="zh-TW"/>
-              </w:rPr>
-              <w:t>/</w:t>
-            </w:r>
-            <w:r>
-              <w:t xml:space="preserve"> </w:t>
-            </w:r>
-            <w:r>
-              <w:rPr>
-                <w:bCs/>
-                <w:sz w:val="24"/>
-                <w:lang w:eastAsia="zh-TW"/>
-              </w:rPr>
-              <w:t>3AA-N06</w:t>
-            </w:r>
-          </w:p>
-        </w:tc>
-        <w:tc>
-          <w:tcPr>
-            <w:tcW w:w="9062" w:type="dxa"/>
-            <w:gridSpan w:val="6"/>
-            <w:shd w:val="clear" w:color="auto" w:fill="EAF1DD" w:themeFill="accent3" w:themeFillTint="33"/>
-          </w:tcPr>
-          <w:p>
-            <w:pPr>
-              <w:spacing w:after="0" w:line="240" w:lineRule="atLeast"/>
-              <w:rPr>
-                <w:bCs/>
-                <w:sz w:val="24"/>
-                <w:lang w:eastAsia="zh-TW"/>
-              </w:rPr>
-            </w:pPr>
-            <w:r>
-              <w:rPr>
-                <w:bCs/>
-                <w:sz w:val="24"/>
-                <w:lang w:eastAsia="zh-TW"/>
-              </w:rPr>
-              <w:t>A020101 - Dull, Blunt</w:t>
-            </w:r>
-          </w:p>
-        </w:tc>
-      </w:tr>
-      <w:tr>
-        <w:tc>
-          <w:tcPr>
-            <w:tcW w:w="2704" w:type="dxa"/>
-            <w:vMerge/>
-          </w:tcPr>
-          <w:p>
-            <w:pPr>
-              <w:spacing w:after="0" w:line="240" w:lineRule="atLeast"/>
-              <w:jc w:val="center"/>
-              <w:rPr>
-                <w:bCs/>
-                <w:sz w:val="24"/>
-                <w:lang w:eastAsia="zh-TW"/>
-              </w:rPr>
-            </w:pPr>
-          </w:p>
-        </w:tc>
-        <w:tc>
-          <w:tcPr>
-            <w:tcW w:w="3391" w:type="dxa"/>
-          </w:tcPr>
-          <w:p>
-            <w:pPr>
-              <w:spacing w:after="0" w:line="240" w:lineRule="atLeast"/>
-              <w:jc w:val="center"/>
-              <w:rPr>
-                <w:bCs/>
-                <w:sz w:val="24"/>
-                <w:lang w:eastAsia="zh-TW"/>
-              </w:rPr>
-            </w:pPr>
-            <w:r>
-              <w:rPr>
-                <w:bCs/>
-                <w:sz w:val="24"/>
-                <w:lang w:eastAsia="zh-TW"/>
-              </w:rPr>
-              <w:t>Year</w:t>
-            </w:r>
-            <w:r>
-              <w:rPr>
-                <w:bCs/>
-                <w:sz w:val="24"/>
-                <w:lang w:eastAsia="zh-TW"/>
-              </w:rPr>
-              <w:t xml:space="preserve"> (2022)</w:t>
-            </w:r>
-          </w:p>
-        </w:tc>
-        <w:tc>
-          <w:tcPr>
-            <w:tcW w:w="993" w:type="dxa"/>
-          </w:tcPr>
-          <w:p>
-            <w:pPr>
-              <w:spacing w:after="0" w:line="276" w:lineRule="auto"/>
-              <w:jc w:val="center"/>
-              <w:rPr>
-                <w:bCs/>
-                <w:sz w:val="24"/>
-                <w:lang w:eastAsia="zh-TW"/>
-              </w:rPr>
-            </w:pPr>
-            <w:r/>
-            <w:r>
-              <w:rPr>
-                <w:rFonts w:ascii="Calibri" w:hAnsi="Calibri"/>
-                <w:sz w:val="20"/>
-              </w:rPr>
-              <w:t>0</w:t>
-            </w:r>
-          </w:p>
-        </w:tc>
-        <w:tc>
-          <w:tcPr>
-            <w:tcW w:w="992" w:type="dxa"/>
-          </w:tcPr>
-          <w:p>
-            <w:pPr>
-              <w:spacing w:after="0" w:line="276" w:lineRule="auto"/>
-              <w:jc w:val="center"/>
-              <w:rPr>
-                <w:bCs/>
-                <w:sz w:val="24"/>
-                <w:lang w:eastAsia="zh-TW"/>
-              </w:rPr>
-            </w:pPr>
-            <w:r/>
-            <w:r>
-              <w:rPr>
-                <w:rFonts w:ascii="Calibri" w:hAnsi="Calibri"/>
-                <w:sz w:val="20"/>
-              </w:rPr>
-              <w:t>0.00%</w:t>
-            </w:r>
-          </w:p>
-        </w:tc>
-        <w:tc>
-          <w:tcPr>
-            <w:tcW w:w="850" w:type="dxa"/>
-          </w:tcPr>
-          <w:p>
-            <w:pPr>
-              <w:spacing w:after="0" w:line="276" w:lineRule="auto"/>
-              <w:jc w:val="center"/>
-              <w:rPr>
-                <w:bCs/>
-                <w:sz w:val="24"/>
-                <w:lang w:eastAsia="zh-TW"/>
-              </w:rPr>
-            </w:pPr>
-            <w:r/>
-            <w:r>
-              <w:rPr>
-                <w:rFonts w:ascii="Calibri" w:hAnsi="Calibri"/>
-                <w:sz w:val="20"/>
-              </w:rPr>
-              <w:t>1</w:t>
-            </w:r>
-          </w:p>
-        </w:tc>
-        <w:tc>
-          <w:tcPr>
-            <w:tcW w:w="993" w:type="dxa"/>
-          </w:tcPr>
-          <w:p>
-            <w:pPr>
-              <w:spacing w:after="0" w:line="276" w:lineRule="auto"/>
-              <w:jc w:val="center"/>
-              <w:rPr>
-                <w:bCs/>
-                <w:sz w:val="24"/>
-                <w:lang w:eastAsia="zh-TW"/>
-              </w:rPr>
-            </w:pPr>
-            <w:r/>
-            <w:r>
-              <w:rPr>
-                <w:rFonts w:ascii="Calibri" w:hAnsi="Calibri"/>
-                <w:sz w:val="20"/>
-              </w:rPr>
-              <w:t>0.06%</w:t>
-            </w:r>
-          </w:p>
-        </w:tc>
-        <w:tc>
-          <w:tcPr>
-            <w:tcW w:w="1843" w:type="dxa"/>
-            <w:vMerge w:val="restart"/>
-          </w:tcPr>
-          <w:p>
-            <w:pPr>
-              <w:spacing w:after="0" w:line="240" w:lineRule="atLeast"/>
-              <w:jc w:val="center"/>
-              <w:rPr>
-                <w:bCs/>
-                <w:sz w:val="24"/>
-                <w:lang w:eastAsia="zh-TW"/>
-              </w:rPr>
-            </w:pPr>
-            <w:r>
-              <w:rPr>
-                <w:bCs/>
-                <w:sz w:val="24"/>
-                <w:lang w:eastAsia="zh-TW"/>
-              </w:rPr>
-              <w:t>No recurrence</w:t>
-            </w:r>
-          </w:p>
-        </w:tc>
-      </w:tr>
-      <w:tr>
-        <w:tc>
-          <w:tcPr>
-            <w:tcW w:w="2704" w:type="dxa"/>
-            <w:vMerge/>
-          </w:tcPr>
-          <w:p>
-            <w:pPr>
-              <w:spacing w:after="0" w:line="240" w:lineRule="atLeast"/>
-              <w:jc w:val="center"/>
-              <w:rPr>
-                <w:bCs/>
-                <w:sz w:val="24"/>
-                <w:lang w:eastAsia="zh-TW"/>
-              </w:rPr>
-            </w:pPr>
-          </w:p>
-        </w:tc>
-        <w:tc>
-          <w:tcPr>
-            <w:tcW w:w="3391" w:type="dxa"/>
-          </w:tcPr>
-          <w:p>
-            <w:pPr>
-              <w:spacing w:after="0" w:line="240" w:lineRule="atLeast"/>
-              <w:jc w:val="center"/>
-              <w:rPr>
-                <w:bCs/>
-                <w:sz w:val="24"/>
-                <w:lang w:eastAsia="zh-TW"/>
-              </w:rPr>
-            </w:pPr>
-            <w:r>
-              <w:rPr>
-                <w:bCs/>
-                <w:sz w:val="24"/>
-                <w:lang w:eastAsia="zh-TW"/>
-              </w:rPr>
-              <w:t>Year</w:t>
-            </w:r>
-            <w:r>
-              <w:rPr>
-                <w:bCs/>
-                <w:sz w:val="24"/>
-                <w:lang w:eastAsia="zh-TW"/>
-              </w:rPr>
-              <w:t xml:space="preserve"> (2023)</w:t>
-            </w:r>
-          </w:p>
-        </w:tc>
-        <w:tc>
-          <w:tcPr>
-            <w:tcW w:w="993" w:type="dxa"/>
-          </w:tcPr>
-          <w:p>
-            <w:pPr>
-              <w:spacing w:after="0" w:line="276" w:lineRule="auto"/>
-              <w:jc w:val="center"/>
-              <w:rPr>
-                <w:bCs/>
-                <w:sz w:val="24"/>
-                <w:lang w:eastAsia="zh-TW"/>
-              </w:rPr>
-            </w:pPr>
-            <w:r/>
-            <w:r>
-              <w:rPr>
-                <w:rFonts w:ascii="Calibri" w:hAnsi="Calibri"/>
-                <w:sz w:val="20"/>
-              </w:rPr>
-              <w:t>0</w:t>
-            </w:r>
-          </w:p>
-        </w:tc>
-        <w:tc>
-          <w:tcPr>
-            <w:tcW w:w="992" w:type="dxa"/>
-          </w:tcPr>
-          <w:p>
-            <w:pPr>
-              <w:spacing w:after="0" w:line="276" w:lineRule="auto"/>
-              <w:jc w:val="center"/>
-              <w:rPr>
-                <w:bCs/>
-                <w:sz w:val="24"/>
-                <w:lang w:eastAsia="zh-TW"/>
-              </w:rPr>
-            </w:pPr>
-            <w:r/>
-            <w:r>
-              <w:rPr>
-                <w:rFonts w:ascii="Calibri" w:hAnsi="Calibri"/>
-                <w:sz w:val="20"/>
-              </w:rPr>
-              <w:t>0.00%</w:t>
-            </w:r>
-          </w:p>
-        </w:tc>
-        <w:tc>
-          <w:tcPr>
-            <w:tcW w:w="850" w:type="dxa"/>
-          </w:tcPr>
-          <w:p>
-            <w:pPr>
-              <w:spacing w:after="0" w:line="276" w:lineRule="auto"/>
-              <w:jc w:val="center"/>
-              <w:rPr>
-                <w:bCs/>
-                <w:sz w:val="24"/>
-                <w:lang w:eastAsia="zh-TW"/>
-              </w:rPr>
-            </w:pPr>
-            <w:r/>
-            <w:r>
-              <w:rPr>
-                <w:rFonts w:ascii="Calibri" w:hAnsi="Calibri"/>
-                <w:sz w:val="20"/>
-              </w:rPr>
-              <w:t>0</w:t>
-            </w:r>
-          </w:p>
-        </w:tc>
-        <w:tc>
-          <w:tcPr>
-            <w:tcW w:w="993" w:type="dxa"/>
-          </w:tcPr>
-          <w:p>
-            <w:pPr>
-              <w:spacing w:after="0" w:line="276" w:lineRule="auto"/>
-              <w:jc w:val="center"/>
-              <w:rPr>
-                <w:bCs/>
-                <w:sz w:val="24"/>
-                <w:lang w:eastAsia="zh-TW"/>
-              </w:rPr>
-            </w:pPr>
-            <w:r/>
-            <w:r>
-              <w:rPr>
-                <w:rFonts w:ascii="Calibri" w:hAnsi="Calibri"/>
-                <w:sz w:val="20"/>
-              </w:rPr>
-              <w:t>0.00%</w:t>
-            </w:r>
-          </w:p>
-        </w:tc>
-        <w:tc>
-          <w:tcPr>
-            <w:tcW w:w="1843" w:type="dxa"/>
-            <w:vMerge/>
-          </w:tcPr>
-          <w:p>
-            <w:pPr>
-              <w:spacing w:after="0" w:line="240" w:lineRule="atLeast"/>
-              <w:jc w:val="center"/>
-              <w:rPr>
-                <w:bCs/>
-                <w:sz w:val="24"/>
-                <w:lang w:eastAsia="zh-TW"/>
-              </w:rPr>
-            </w:pPr>
-          </w:p>
-        </w:tc>
-      </w:tr>
-      <w:tr>
-        <w:tc>
-          <w:tcPr>
-            <w:tcW w:w="2704" w:type="dxa"/>
-            <w:vMerge/>
-          </w:tcPr>
-          <w:p>
-            <w:pPr>
-              <w:spacing w:after="0" w:line="240" w:lineRule="atLeast"/>
-              <w:jc w:val="center"/>
-              <w:rPr>
-                <w:bCs/>
-                <w:sz w:val="24"/>
-                <w:lang w:eastAsia="zh-TW"/>
-              </w:rPr>
-            </w:pPr>
-          </w:p>
-        </w:tc>
-        <w:tc>
-          <w:tcPr>
-            <w:tcW w:w="3391" w:type="dxa"/>
-          </w:tcPr>
-          <w:p>
-            <w:pPr>
-              <w:spacing w:after="0" w:line="240" w:lineRule="atLeast"/>
-              <w:jc w:val="center"/>
-              <w:rPr>
-                <w:bCs/>
-                <w:sz w:val="24"/>
-                <w:lang w:eastAsia="zh-TW"/>
-              </w:rPr>
-            </w:pPr>
-            <w:r>
-              <w:rPr>
-                <w:bCs/>
-                <w:sz w:val="24"/>
-                <w:lang w:eastAsia="zh-TW"/>
-              </w:rPr>
-              <w:t>Year</w:t>
-            </w:r>
-            <w:r>
-              <w:rPr>
-                <w:bCs/>
-                <w:sz w:val="24"/>
-                <w:lang w:eastAsia="zh-TW"/>
-              </w:rPr>
-              <w:t xml:space="preserve"> (2024)</w:t>
-            </w:r>
-          </w:p>
-        </w:tc>
-        <w:tc>
-          <w:tcPr>
-            <w:tcW w:w="993" w:type="dxa"/>
-          </w:tcPr>
-          <w:p>
-            <w:pPr>
-              <w:spacing w:after="0" w:line="276" w:lineRule="auto"/>
-              <w:jc w:val="center"/>
-              <w:rPr>
-                <w:bCs/>
-                <w:sz w:val="24"/>
-                <w:lang w:eastAsia="zh-TW"/>
-              </w:rPr>
-            </w:pPr>
-            <w:r/>
-            <w:r>
-              <w:rPr>
-                <w:rFonts w:ascii="Calibri" w:hAnsi="Calibri"/>
-                <w:sz w:val="20"/>
-              </w:rPr>
-              <w:t>0</w:t>
-            </w:r>
-          </w:p>
-        </w:tc>
-        <w:tc>
-          <w:tcPr>
-            <w:tcW w:w="992" w:type="dxa"/>
-          </w:tcPr>
-          <w:p>
-            <w:pPr>
-              <w:spacing w:after="0" w:line="276" w:lineRule="auto"/>
-              <w:jc w:val="center"/>
-              <w:rPr>
-                <w:bCs/>
-                <w:sz w:val="24"/>
-                <w:lang w:eastAsia="zh-TW"/>
-              </w:rPr>
-            </w:pPr>
-            <w:r/>
-            <w:r>
-              <w:rPr>
-                <w:rFonts w:ascii="Calibri" w:hAnsi="Calibri"/>
-                <w:sz w:val="20"/>
-              </w:rPr>
-              <w:t>0.00%</w:t>
-            </w:r>
-          </w:p>
-        </w:tc>
-        <w:tc>
-          <w:tcPr>
-            <w:tcW w:w="850" w:type="dxa"/>
-          </w:tcPr>
-          <w:p>
-            <w:pPr>
-              <w:spacing w:after="0" w:line="276" w:lineRule="auto"/>
-              <w:jc w:val="center"/>
-              <w:rPr>
-                <w:bCs/>
-                <w:sz w:val="24"/>
-                <w:lang w:eastAsia="zh-TW"/>
-              </w:rPr>
-            </w:pPr>
-            <w:r/>
-            <w:r>
-              <w:rPr>
-                <w:rFonts w:ascii="Calibri" w:hAnsi="Calibri"/>
-                <w:sz w:val="20"/>
-              </w:rPr>
-              <w:t>0</w:t>
-            </w:r>
-          </w:p>
-        </w:tc>
-        <w:tc>
-          <w:tcPr>
-            <w:tcW w:w="993" w:type="dxa"/>
-          </w:tcPr>
-          <w:p>
-            <w:pPr>
-              <w:spacing w:after="0" w:line="276" w:lineRule="auto"/>
-              <w:jc w:val="center"/>
-              <w:rPr>
-                <w:bCs/>
-                <w:sz w:val="24"/>
-                <w:lang w:eastAsia="zh-TW"/>
-              </w:rPr>
-            </w:pPr>
-            <w:r/>
-            <w:r>
-              <w:rPr>
-                <w:rFonts w:ascii="Calibri" w:hAnsi="Calibri"/>
-                <w:sz w:val="20"/>
-              </w:rPr>
-              <w:t>0.00%</w:t>
-            </w:r>
-          </w:p>
-        </w:tc>
-        <w:tc>
-          <w:tcPr>
-            <w:tcW w:w="1843" w:type="dxa"/>
-            <w:vMerge/>
-          </w:tcPr>
-          <w:p>
-            <w:pPr>
-              <w:spacing w:after="0" w:line="240" w:lineRule="atLeast"/>
-              <w:jc w:val="center"/>
-              <w:rPr>
-                <w:bCs/>
-                <w:sz w:val="24"/>
-                <w:lang w:eastAsia="zh-TW"/>
-              </w:rPr>
-            </w:pPr>
-          </w:p>
-        </w:tc>
-      </w:tr>
-      <w:tr>
-        <w:tc>
-          <w:tcPr>
-            <w:tcW w:w="2704" w:type="dxa"/>
-            <w:vMerge w:val="restart"/>
-            <w:vAlign w:val="center"/>
-          </w:tcPr>
-          <w:p>
-            <w:pPr>
-              <w:spacing w:after="0" w:line="240" w:lineRule="atLeast"/>
-              <w:jc w:val="center"/>
-              <w:rPr>
-                <w:bCs/>
-                <w:sz w:val="24"/>
-                <w:lang w:eastAsia="zh-TW"/>
-              </w:rPr>
-            </w:pPr>
-            <w:r>
-              <w:rPr>
-                <w:bCs/>
-                <w:sz w:val="24"/>
-                <w:lang w:eastAsia="zh-TW"/>
-              </w:rPr>
-              <w:t>471987540RestorationKR</w:t>
-            </w:r>
-          </w:p>
-          <w:p>
-            <w:pPr>
-              <w:spacing w:after="0" w:line="240" w:lineRule="atLeast"/>
-              <w:jc w:val="center"/>
-              <w:rPr>
-                <w:bCs/>
-                <w:sz w:val="24"/>
-                <w:lang w:eastAsia="zh-TW"/>
-              </w:rPr>
-            </w:pPr>
-            <w:r>
-              <w:rPr>
-                <w:bCs/>
-                <w:sz w:val="24"/>
-                <w:lang w:eastAsia="zh-TW"/>
-              </w:rPr>
-              <w:t>/ 6AA-061</w:t>
-            </w:r>
-          </w:p>
-        </w:tc>
-        <w:tc>
-          <w:tcPr>
-            <w:tcW w:w="9062" w:type="dxa"/>
-            <w:gridSpan w:val="6"/>
-            <w:shd w:val="clear" w:color="auto" w:fill="EAF1DD" w:themeFill="accent3" w:themeFillTint="33"/>
-          </w:tcPr>
-          <w:p>
-            <w:pPr>
-              <w:spacing w:after="0" w:line="240" w:lineRule="atLeast"/>
-              <w:rPr>
-                <w:bCs/>
-                <w:sz w:val="24"/>
-                <w:lang w:eastAsia="zh-TW"/>
-              </w:rPr>
-            </w:pPr>
-            <w:r>
-              <w:rPr>
-                <w:bCs/>
-                <w:sz w:val="24"/>
-                <w:lang w:eastAsia="zh-TW"/>
-              </w:rPr>
-              <w:t>A010103 - Inadequacy of Device Shape and/or Size</w:t>
-            </w:r>
-          </w:p>
-        </w:tc>
-      </w:tr>
-      <w:tr>
-        <w:tc>
-          <w:tcPr>
-            <w:tcW w:w="2704" w:type="dxa"/>
-            <w:vMerge/>
-          </w:tcPr>
-          <w:p>
-            <w:pPr>
-              <w:spacing w:after="0" w:line="240" w:lineRule="atLeast"/>
-              <w:jc w:val="center"/>
-              <w:rPr>
-                <w:bCs/>
-                <w:sz w:val="24"/>
-                <w:lang w:eastAsia="zh-TW"/>
-              </w:rPr>
-            </w:pPr>
-          </w:p>
-        </w:tc>
-        <w:tc>
-          <w:tcPr>
-            <w:tcW w:w="3391" w:type="dxa"/>
-          </w:tcPr>
-          <w:p>
-            <w:pPr>
-              <w:spacing w:after="0" w:line="240" w:lineRule="atLeast"/>
-              <w:jc w:val="center"/>
-              <w:rPr>
-                <w:bCs/>
-                <w:sz w:val="24"/>
-                <w:lang w:eastAsia="zh-TW"/>
-              </w:rPr>
-            </w:pPr>
-            <w:r>
-              <w:rPr>
-                <w:bCs/>
-                <w:sz w:val="24"/>
-                <w:lang w:eastAsia="zh-TW"/>
-              </w:rPr>
-              <w:t>Year</w:t>
-            </w:r>
-            <w:r>
-              <w:rPr>
-                <w:bCs/>
-                <w:sz w:val="24"/>
-                <w:lang w:eastAsia="zh-TW"/>
-              </w:rPr>
-              <w:t xml:space="preserve"> (2022)</w:t>
-            </w:r>
-          </w:p>
-        </w:tc>
-        <w:tc>
-          <w:tcPr>
-            <w:tcW w:w="993" w:type="dxa"/>
-          </w:tcPr>
-          <w:p>
-            <w:pPr>
-              <w:spacing w:after="0" w:line="276" w:lineRule="auto"/>
-              <w:jc w:val="center"/>
-              <w:rPr>
-                <w:bCs/>
-                <w:sz w:val="24"/>
-                <w:lang w:eastAsia="zh-TW"/>
-              </w:rPr>
-            </w:pPr>
-            <w:r/>
-            <w:r>
-              <w:rPr>
-                <w:rFonts w:ascii="Calibri" w:hAnsi="Calibri"/>
-                <w:sz w:val="20"/>
-              </w:rPr>
-              <w:t>0</w:t>
-            </w:r>
-          </w:p>
-        </w:tc>
-        <w:tc>
-          <w:tcPr>
-            <w:tcW w:w="992" w:type="dxa"/>
-          </w:tcPr>
-          <w:p>
-            <w:pPr>
-              <w:spacing w:after="0" w:line="276" w:lineRule="auto"/>
-              <w:jc w:val="center"/>
-              <w:rPr>
-                <w:bCs/>
-                <w:sz w:val="24"/>
-                <w:lang w:eastAsia="zh-TW"/>
-              </w:rPr>
-            </w:pPr>
-            <w:r/>
-            <w:r>
-              <w:rPr>
-                <w:rFonts w:ascii="Calibri" w:hAnsi="Calibri"/>
-                <w:sz w:val="20"/>
-              </w:rPr>
-              <w:t>0.00%</w:t>
-            </w:r>
-          </w:p>
-        </w:tc>
-        <w:tc>
-          <w:tcPr>
-            <w:tcW w:w="850" w:type="dxa"/>
-          </w:tcPr>
-          <w:p>
-            <w:pPr>
-              <w:spacing w:after="0" w:line="276" w:lineRule="auto"/>
-              <w:jc w:val="center"/>
-              <w:rPr>
-                <w:bCs/>
-                <w:sz w:val="24"/>
-                <w:lang w:eastAsia="zh-TW"/>
-              </w:rPr>
-            </w:pPr>
-            <w:r/>
-            <w:r>
-              <w:rPr>
-                <w:rFonts w:ascii="Calibri" w:hAnsi="Calibri"/>
-                <w:sz w:val="20"/>
-              </w:rPr>
-              <w:t>0</w:t>
-            </w:r>
-          </w:p>
-        </w:tc>
-        <w:tc>
-          <w:tcPr>
-            <w:tcW w:w="993" w:type="dxa"/>
-          </w:tcPr>
-          <w:p>
-            <w:pPr>
-              <w:spacing w:after="0" w:line="276" w:lineRule="auto"/>
-              <w:jc w:val="center"/>
-              <w:rPr>
-                <w:bCs/>
-                <w:sz w:val="24"/>
-                <w:lang w:eastAsia="zh-TW"/>
-              </w:rPr>
-            </w:pPr>
-            <w:r/>
-            <w:r>
-              <w:rPr>
-                <w:rFonts w:ascii="Calibri" w:hAnsi="Calibri"/>
-                <w:sz w:val="20"/>
-              </w:rPr>
-              <w:t>0.00%</w:t>
             </w:r>
           </w:p>
         </w:tc>

</xml_diff>